<commit_message>
The Documents- The Documents are Pushed!
</commit_message>
<xml_diff>
--- a/Documentatie/Verslagen/onderzoek Tom.docx
+++ b/Documentatie/Verslagen/onderzoek Tom.docx
@@ -13,15 +13,20 @@
       </w:sdtPr>
       <w:sdtContent>
         <w:p>
+          <w:pPr>
+            <w:rPr>
+              <w:sz w:val="44"/>
+              <w:szCs w:val="44"/>
+            </w:rPr>
+          </w:pPr>
           <w:r>
             <w:rPr>
-              <w:noProof/>
               <w:color w:val="FF0000"/>
             </w:rPr>
             <mc:AlternateContent>
               <mc:Choice Requires="wpg">
                 <w:drawing>
-                  <wp:anchor distT="0" distB="0" distL="114300" distR="114300" simplePos="0" relativeHeight="251659264" behindDoc="0" locked="0" layoutInCell="1" allowOverlap="1" wp14:anchorId="4E399FEB" wp14:editId="13B8C767">
+                  <wp:anchor distT="0" distB="0" distL="114300" distR="114300" simplePos="0" relativeHeight="251659264" behindDoc="0" locked="0" layoutInCell="1" allowOverlap="1" wp14:anchorId="3A462951" wp14:editId="3A462952">
                     <wp:simplePos x="0" y="0"/>
                     <wp:positionH relativeFrom="page">
                       <wp:align>right</wp:align>
@@ -175,6 +180,7 @@
                                       <w:color w:val="FFFFFF" w:themeColor="background1"/>
                                       <w:sz w:val="96"/>
                                       <w:szCs w:val="96"/>
+                                      <w:lang w:val="en-US"/>
                                     </w:rPr>
                                   </w:pPr>
                                   <w:r>
@@ -182,6 +188,7 @@
                                       <w:color w:val="FFFFFF" w:themeColor="background1"/>
                                       <w:sz w:val="96"/>
                                       <w:szCs w:val="96"/>
+                                      <w:lang w:val="en-US"/>
                                     </w:rPr>
                                     <w:t>Project 7/8</w:t>
                                   </w:r>
@@ -249,6 +256,49 @@
                                       <w:color w:val="FFFFFF" w:themeColor="background1"/>
                                       <w:sz w:val="24"/>
                                       <w:szCs w:val="24"/>
+                                      <w:lang w:val="en-US"/>
+                                    </w:rPr>
+                                  </w:pPr>
+                                </w:p>
+                                <w:p>
+                                  <w:pPr>
+                                    <w:pStyle w:val="Geenafstand"/>
+                                    <w:spacing w:line="276" w:lineRule="auto"/>
+                                    <w:rPr>
+                                      <w:b/>
+                                      <w:bCs/>
+                                      <w:color w:val="FFFFFF" w:themeColor="background1"/>
+                                      <w:sz w:val="24"/>
+                                      <w:szCs w:val="24"/>
+                                      <w:lang w:val="en-US"/>
+                                    </w:rPr>
+                                  </w:pPr>
+                                </w:p>
+                                <w:p>
+                                  <w:pPr>
+                                    <w:pStyle w:val="Geenafstand"/>
+                                    <w:spacing w:line="276" w:lineRule="auto"/>
+                                    <w:rPr>
+                                      <w:b/>
+                                      <w:bCs/>
+                                      <w:color w:val="FFFFFF" w:themeColor="background1"/>
+                                      <w:sz w:val="24"/>
+                                      <w:szCs w:val="24"/>
+                                      <w:lang w:val="en-US"/>
+                                    </w:rPr>
+                                  </w:pPr>
+                                </w:p>
+                                <w:p>
+                                  <w:pPr>
+                                    <w:pStyle w:val="Geenafstand"/>
+                                    <w:spacing w:line="276" w:lineRule="auto"/>
+                                    <w:rPr>
+                                      <w:b/>
+                                      <w:bCs/>
+                                      <w:color w:val="FFFFFF" w:themeColor="background1"/>
+                                      <w:sz w:val="24"/>
+                                      <w:szCs w:val="24"/>
+                                      <w:lang w:val="en-US"/>
                                     </w:rPr>
                                   </w:pPr>
                                   <w:r>
@@ -258,8 +308,9 @@
                                       <w:color w:val="FFFFFF" w:themeColor="background1"/>
                                       <w:sz w:val="24"/>
                                       <w:szCs w:val="24"/>
+                                      <w:lang w:val="en-US"/>
                                     </w:rPr>
-                                    <w:t>Merel van der Leeden (1103194)</w:t>
+                                    <w:t xml:space="preserve">Merel van der Leeden (1103194) Hannah Saunders (1093894) </w:t>
                                   </w:r>
                                 </w:p>
                                 <w:p>
@@ -272,8 +323,10 @@
                                       <w:color w:val="FFFFFF" w:themeColor="background1"/>
                                       <w:sz w:val="24"/>
                                       <w:szCs w:val="24"/>
+                                      <w:lang w:val="en-US"/>
                                     </w:rPr>
                                   </w:pPr>
+                                  <w:proofErr w:type="spellStart"/>
                                   <w:r>
                                     <w:rPr>
                                       <w:b/>
@@ -281,8 +334,21 @@
                                       <w:color w:val="FFFFFF" w:themeColor="background1"/>
                                       <w:sz w:val="24"/>
                                       <w:szCs w:val="24"/>
+                                      <w:lang w:val="en-US"/>
                                     </w:rPr>
-                                    <w:t>Hannah Saunders</w:t>
+                                    <w:t>Corné</w:t>
+                                  </w:r>
+                                  <w:proofErr w:type="spellEnd"/>
+                                  <w:r>
+                                    <w:rPr>
+                                      <w:b/>
+                                      <w:bCs/>
+                                      <w:color w:val="FFFFFF" w:themeColor="background1"/>
+                                      <w:sz w:val="24"/>
+                                      <w:szCs w:val="24"/>
+                                      <w:lang w:val="en-US"/>
+                                    </w:rPr>
+                                    <w:t xml:space="preserve"> Noorlander (1054564) </w:t>
                                   </w:r>
                                 </w:p>
                                 <w:p>
@@ -295,6 +361,7 @@
                                       <w:color w:val="FFFFFF" w:themeColor="background1"/>
                                       <w:sz w:val="24"/>
                                       <w:szCs w:val="24"/>
+                                      <w:lang w:val="en-US"/>
                                     </w:rPr>
                                   </w:pPr>
                                   <w:r>
@@ -304,8 +371,9 @@
                                       <w:color w:val="FFFFFF" w:themeColor="background1"/>
                                       <w:sz w:val="24"/>
                                       <w:szCs w:val="24"/>
+                                      <w:lang w:val="en-US"/>
                                     </w:rPr>
-                                    <w:t>Corné Noorlander</w:t>
+                                    <w:t xml:space="preserve">Fabio Wolthuis (1093379) </w:t>
                                   </w:r>
                                 </w:p>
                                 <w:p>
@@ -318,6 +386,7 @@
                                       <w:color w:val="FFFFFF" w:themeColor="background1"/>
                                       <w:sz w:val="24"/>
                                       <w:szCs w:val="24"/>
+                                      <w:lang w:val="en-US"/>
                                     </w:rPr>
                                   </w:pPr>
                                   <w:r>
@@ -327,8 +396,9 @@
                                       <w:color w:val="FFFFFF" w:themeColor="background1"/>
                                       <w:sz w:val="24"/>
                                       <w:szCs w:val="24"/>
+                                      <w:lang w:val="en-US"/>
                                     </w:rPr>
-                                    <w:t>Fabio Wolthuis</w:t>
+                                    <w:t xml:space="preserve">Tom Heijmans (1079471) </w:t>
                                   </w:r>
                                 </w:p>
                                 <w:p>
@@ -341,6 +411,7 @@
                                       <w:color w:val="FFFFFF" w:themeColor="background1"/>
                                       <w:sz w:val="24"/>
                                       <w:szCs w:val="24"/>
+                                      <w:lang w:val="en-US"/>
                                     </w:rPr>
                                   </w:pPr>
                                   <w:r>
@@ -350,8 +421,33 @@
                                       <w:color w:val="FFFFFF" w:themeColor="background1"/>
                                       <w:sz w:val="24"/>
                                       <w:szCs w:val="24"/>
+                                      <w:lang w:val="en-US"/>
                                     </w:rPr>
-                                    <w:t>Tom Heijmans</w:t>
+                                    <w:t xml:space="preserve">Sandra </w:t>
+                                  </w:r>
+                                  <w:proofErr w:type="spellStart"/>
+                                  <w:r>
+                                    <w:rPr>
+                                      <w:b/>
+                                      <w:bCs/>
+                                      <w:color w:val="FFFFFF" w:themeColor="background1"/>
+                                      <w:sz w:val="24"/>
+                                      <w:szCs w:val="24"/>
+                                      <w:lang w:val="en-US"/>
+                                    </w:rPr>
+                                    <w:t>Hekkelman</w:t>
+                                  </w:r>
+                                  <w:proofErr w:type="spellEnd"/>
+                                  <w:r>
+                                    <w:rPr>
+                                      <w:b/>
+                                      <w:bCs/>
+                                      <w:color w:val="FFFFFF" w:themeColor="background1"/>
+                                      <w:sz w:val="24"/>
+                                      <w:szCs w:val="24"/>
+                                      <w:lang w:val="en-US"/>
+                                    </w:rPr>
+                                    <w:t xml:space="preserve"> &amp;</w:t>
                                   </w:r>
                                 </w:p>
                                 <w:p>
@@ -364,6 +460,7 @@
                                       <w:color w:val="FFFFFF" w:themeColor="background1"/>
                                       <w:sz w:val="24"/>
                                       <w:szCs w:val="24"/>
+                                      <w:lang w:val="en-US"/>
                                     </w:rPr>
                                   </w:pPr>
                                   <w:r>
@@ -373,8 +470,33 @@
                                       <w:color w:val="FFFFFF" w:themeColor="background1"/>
                                       <w:sz w:val="24"/>
                                       <w:szCs w:val="24"/>
+                                      <w:lang w:val="en-US"/>
                                     </w:rPr>
-                                    <w:t>RDW test centrum Lelystand</w:t>
+                                    <w:t xml:space="preserve">Wouter </w:t>
+                                  </w:r>
+                                  <w:proofErr w:type="spellStart"/>
+                                  <w:r>
+                                    <w:rPr>
+                                      <w:b/>
+                                      <w:bCs/>
+                                      <w:color w:val="FFFFFF" w:themeColor="background1"/>
+                                      <w:sz w:val="24"/>
+                                      <w:szCs w:val="24"/>
+                                      <w:lang w:val="en-US"/>
+                                    </w:rPr>
+                                    <w:t>Volders</w:t>
+                                  </w:r>
+                                  <w:proofErr w:type="spellEnd"/>
+                                  <w:r>
+                                    <w:rPr>
+                                      <w:b/>
+                                      <w:bCs/>
+                                      <w:color w:val="FFFFFF" w:themeColor="background1"/>
+                                      <w:sz w:val="24"/>
+                                      <w:szCs w:val="24"/>
+                                      <w:lang w:val="en-US"/>
+                                    </w:rPr>
+                                    <w:t xml:space="preserve"> </w:t>
                                   </w:r>
                                 </w:p>
                                 <w:p>
@@ -387,6 +509,69 @@
                                       <w:color w:val="FFFFFF" w:themeColor="background1"/>
                                       <w:sz w:val="24"/>
                                       <w:szCs w:val="24"/>
+                                      <w:lang w:val="en-US"/>
+                                    </w:rPr>
+                                  </w:pPr>
+                                  <w:proofErr w:type="spellStart"/>
+                                  <w:r>
+                                    <w:rPr>
+                                      <w:b/>
+                                      <w:bCs/>
+                                      <w:color w:val="FFFFFF" w:themeColor="background1"/>
+                                      <w:sz w:val="24"/>
+                                      <w:szCs w:val="24"/>
+                                      <w:lang w:val="en-US"/>
+                                    </w:rPr>
+                                    <w:t>Eerste</w:t>
+                                  </w:r>
+                                  <w:proofErr w:type="spellEnd"/>
+                                  <w:r>
+                                    <w:rPr>
+                                      <w:b/>
+                                      <w:bCs/>
+                                      <w:color w:val="FFFFFF" w:themeColor="background1"/>
+                                      <w:sz w:val="24"/>
+                                      <w:szCs w:val="24"/>
+                                      <w:lang w:val="en-US"/>
+                                    </w:rPr>
+                                    <w:t xml:space="preserve"> </w:t>
+                                  </w:r>
+                                  <w:proofErr w:type="spellStart"/>
+                                  <w:r>
+                                    <w:rPr>
+                                      <w:b/>
+                                      <w:bCs/>
+                                      <w:color w:val="FFFFFF" w:themeColor="background1"/>
+                                      <w:sz w:val="24"/>
+                                      <w:szCs w:val="24"/>
+                                      <w:lang w:val="en-US"/>
+                                    </w:rPr>
+                                    <w:t>gelegenheid</w:t>
+                                  </w:r>
+                                  <w:proofErr w:type="spellEnd"/>
+                                  <w:r>
+                                    <w:rPr>
+                                      <w:b/>
+                                      <w:bCs/>
+                                      <w:color w:val="FFFFFF" w:themeColor="background1"/>
+                                      <w:sz w:val="24"/>
+                                      <w:szCs w:val="24"/>
+                                      <w:lang w:val="en-US"/>
+                                    </w:rPr>
+                                    <w:t xml:space="preserve"> </w:t>
+                                  </w:r>
+                                </w:p>
+                                <w:p>
+                                  <w:pPr>
+                                    <w:pStyle w:val="Geenafstand"/>
+                                    <w:spacing w:line="276" w:lineRule="auto"/>
+                                    <w:rPr>
+                                      <w:b/>
+                                      <w:bCs/>
+                                      <w:color w:val="FFFFFF" w:themeColor="background1"/>
+                                      <w:sz w:val="24"/>
+                                      <w:szCs w:val="24"/>
+                                      <w:lang w:val="en-US"/>
                                     </w:rPr>
                                   </w:pPr>
                                   <w:r>
@@ -396,8 +581,9 @@
                                       <w:color w:val="FFFFFF" w:themeColor="background1"/>
                                       <w:sz w:val="24"/>
                                       <w:szCs w:val="24"/>
+                                      <w:lang w:val="en-US"/>
                                     </w:rPr>
-                                    <w:t>13/02/2026</w:t>
+                                    <w:t>7/6/2026</w:t>
                                   </w:r>
                                 </w:p>
                               </w:txbxContent>
@@ -420,7 +606,7 @@
               </mc:Choice>
               <mc:Fallback>
                 <w:pict>
-                  <v:group w14:anchorId="4E399FEB" id="Groep 75" o:spid="_x0000_s1026" style="position:absolute;margin-left:193.95pt;margin-top:0;width:245.15pt;height:11in;z-index:251659264;mso-width-percent:400;mso-height-percent:1000;mso-position-horizontal:right;mso-position-horizontal-relative:page;mso-position-vertical:top;mso-position-vertical-relative:page;mso-width-percent:400;mso-height-percent:1000" coordsize="31136,100584" o:gfxdata="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">
+                  <v:group w14:anchorId="3A462951" id="Groep 75" o:spid="_x0000_s1026" style="position:absolute;margin-left:193.95pt;margin-top:0;width:245.15pt;height:11in;z-index:251659264;mso-width-percent:400;mso-height-percent:1000;mso-position-horizontal:right;mso-position-horizontal-relative:page;mso-position-vertical:top;mso-position-vertical-relative:page;mso-width-percent:400;mso-height-percent:1000" coordsize="31136,100584" o:gfxdata="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">
                     <v:rect id="Rechthoek 459" o:spid="_x0000_s1027" alt="Light vertical" style="position:absolute;width:1385;height:100584;visibility:visible;mso-wrap-style:square;v-text-anchor:middle" o:gfxdata="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" fillcolor="black [3213]" stroked="f" strokecolor="white" strokeweight="1pt">
                       <v:shadow color="#d8d8d8" offset="3pt,3pt"/>
                     </v:rect>
@@ -437,6 +623,7 @@
                                 <w:color w:val="FFFFFF" w:themeColor="background1"/>
                                 <w:sz w:val="96"/>
                                 <w:szCs w:val="96"/>
+                                <w:lang w:val="en-US"/>
                               </w:rPr>
                             </w:pPr>
                             <w:r>
@@ -444,6 +631,7 @@
                                 <w:color w:val="FFFFFF" w:themeColor="background1"/>
                                 <w:sz w:val="96"/>
                                 <w:szCs w:val="96"/>
+                                <w:lang w:val="en-US"/>
                               </w:rPr>
                               <w:t>Project 7/8</w:t>
                             </w:r>
@@ -466,6 +654,49 @@
                                 <w:color w:val="FFFFFF" w:themeColor="background1"/>
                                 <w:sz w:val="24"/>
                                 <w:szCs w:val="24"/>
+                                <w:lang w:val="en-US"/>
+                              </w:rPr>
+                            </w:pPr>
+                          </w:p>
+                          <w:p>
+                            <w:pPr>
+                              <w:pStyle w:val="Geenafstand"/>
+                              <w:spacing w:line="276" w:lineRule="auto"/>
+                              <w:rPr>
+                                <w:b/>
+                                <w:bCs/>
+                                <w:color w:val="FFFFFF" w:themeColor="background1"/>
+                                <w:sz w:val="24"/>
+                                <w:szCs w:val="24"/>
+                                <w:lang w:val="en-US"/>
+                              </w:rPr>
+                            </w:pPr>
+                          </w:p>
+                          <w:p>
+                            <w:pPr>
+                              <w:pStyle w:val="Geenafstand"/>
+                              <w:spacing w:line="276" w:lineRule="auto"/>
+                              <w:rPr>
+                                <w:b/>
+                                <w:bCs/>
+                                <w:color w:val="FFFFFF" w:themeColor="background1"/>
+                                <w:sz w:val="24"/>
+                                <w:szCs w:val="24"/>
+                                <w:lang w:val="en-US"/>
+                              </w:rPr>
+                            </w:pPr>
+                          </w:p>
+                          <w:p>
+                            <w:pPr>
+                              <w:pStyle w:val="Geenafstand"/>
+                              <w:spacing w:line="276" w:lineRule="auto"/>
+                              <w:rPr>
+                                <w:b/>
+                                <w:bCs/>
+                                <w:color w:val="FFFFFF" w:themeColor="background1"/>
+                                <w:sz w:val="24"/>
+                                <w:szCs w:val="24"/>
+                                <w:lang w:val="en-US"/>
                               </w:rPr>
                             </w:pPr>
                             <w:r>
@@ -475,8 +706,9 @@
                                 <w:color w:val="FFFFFF" w:themeColor="background1"/>
                                 <w:sz w:val="24"/>
                                 <w:szCs w:val="24"/>
+                                <w:lang w:val="en-US"/>
                               </w:rPr>
-                              <w:t>Merel van der Leeden (1103194)</w:t>
+                              <w:t xml:space="preserve">Merel van der Leeden (1103194) Hannah Saunders (1093894) </w:t>
                             </w:r>
                           </w:p>
                           <w:p>
@@ -489,8 +721,10 @@
                                 <w:color w:val="FFFFFF" w:themeColor="background1"/>
                                 <w:sz w:val="24"/>
                                 <w:szCs w:val="24"/>
+                                <w:lang w:val="en-US"/>
                               </w:rPr>
                             </w:pPr>
+                            <w:proofErr w:type="spellStart"/>
                             <w:r>
                               <w:rPr>
                                 <w:b/>
@@ -498,8 +732,21 @@
                                 <w:color w:val="FFFFFF" w:themeColor="background1"/>
                                 <w:sz w:val="24"/>
                                 <w:szCs w:val="24"/>
+                                <w:lang w:val="en-US"/>
                               </w:rPr>
-                              <w:t>Hannah Saunders</w:t>
+                              <w:t>Corné</w:t>
+                            </w:r>
+                            <w:proofErr w:type="spellEnd"/>
+                            <w:r>
+                              <w:rPr>
+                                <w:b/>
+                                <w:bCs/>
+                                <w:color w:val="FFFFFF" w:themeColor="background1"/>
+                                <w:sz w:val="24"/>
+                                <w:szCs w:val="24"/>
+                                <w:lang w:val="en-US"/>
+                              </w:rPr>
+                              <w:t xml:space="preserve"> Noorlander (1054564) </w:t>
                             </w:r>
                           </w:p>
                           <w:p>
@@ -512,6 +759,7 @@
                                 <w:color w:val="FFFFFF" w:themeColor="background1"/>
                                 <w:sz w:val="24"/>
                                 <w:szCs w:val="24"/>
+                                <w:lang w:val="en-US"/>
                               </w:rPr>
                             </w:pPr>
                             <w:r>
@@ -521,8 +769,9 @@
                                 <w:color w:val="FFFFFF" w:themeColor="background1"/>
                                 <w:sz w:val="24"/>
                                 <w:szCs w:val="24"/>
+                                <w:lang w:val="en-US"/>
                               </w:rPr>
-                              <w:t>Corné Noorlander</w:t>
+                              <w:t xml:space="preserve">Fabio Wolthuis (1093379) </w:t>
                             </w:r>
                           </w:p>
                           <w:p>
@@ -535,6 +784,7 @@
                                 <w:color w:val="FFFFFF" w:themeColor="background1"/>
                                 <w:sz w:val="24"/>
                                 <w:szCs w:val="24"/>
+                                <w:lang w:val="en-US"/>
                               </w:rPr>
                             </w:pPr>
                             <w:r>
@@ -544,8 +794,9 @@
                                 <w:color w:val="FFFFFF" w:themeColor="background1"/>
                                 <w:sz w:val="24"/>
                                 <w:szCs w:val="24"/>
+                                <w:lang w:val="en-US"/>
                               </w:rPr>
-                              <w:t>Fabio Wolthuis</w:t>
+                              <w:t xml:space="preserve">Tom Heijmans (1079471) </w:t>
                             </w:r>
                           </w:p>
                           <w:p>
@@ -558,6 +809,7 @@
                                 <w:color w:val="FFFFFF" w:themeColor="background1"/>
                                 <w:sz w:val="24"/>
                                 <w:szCs w:val="24"/>
+                                <w:lang w:val="en-US"/>
                               </w:rPr>
                             </w:pPr>
                             <w:r>
@@ -567,8 +819,33 @@
                                 <w:color w:val="FFFFFF" w:themeColor="background1"/>
                                 <w:sz w:val="24"/>
                                 <w:szCs w:val="24"/>
+                                <w:lang w:val="en-US"/>
                               </w:rPr>
-                              <w:t>Tom Heijmans</w:t>
+                              <w:t xml:space="preserve">Sandra </w:t>
+                            </w:r>
+                            <w:proofErr w:type="spellStart"/>
+                            <w:r>
+                              <w:rPr>
+                                <w:b/>
+                                <w:bCs/>
+                                <w:color w:val="FFFFFF" w:themeColor="background1"/>
+                                <w:sz w:val="24"/>
+                                <w:szCs w:val="24"/>
+                                <w:lang w:val="en-US"/>
+                              </w:rPr>
+                              <w:t>Hekkelman</w:t>
+                            </w:r>
+                            <w:proofErr w:type="spellEnd"/>
+                            <w:r>
+                              <w:rPr>
+                                <w:b/>
+                                <w:bCs/>
+                                <w:color w:val="FFFFFF" w:themeColor="background1"/>
+                                <w:sz w:val="24"/>
+                                <w:szCs w:val="24"/>
+                                <w:lang w:val="en-US"/>
+                              </w:rPr>
+                              <w:t xml:space="preserve"> &amp;</w:t>
                             </w:r>
                           </w:p>
                           <w:p>
@@ -581,6 +858,7 @@
                                 <w:color w:val="FFFFFF" w:themeColor="background1"/>
                                 <w:sz w:val="24"/>
                                 <w:szCs w:val="24"/>
+                                <w:lang w:val="en-US"/>
                               </w:rPr>
                             </w:pPr>
                             <w:r>
@@ -590,8 +868,33 @@
                                 <w:color w:val="FFFFFF" w:themeColor="background1"/>
                                 <w:sz w:val="24"/>
                                 <w:szCs w:val="24"/>
+                                <w:lang w:val="en-US"/>
                               </w:rPr>
-                              <w:t>RDW test centrum Lelystand</w:t>
+                              <w:t xml:space="preserve">Wouter </w:t>
+                            </w:r>
+                            <w:proofErr w:type="spellStart"/>
+                            <w:r>
+                              <w:rPr>
+                                <w:b/>
+                                <w:bCs/>
+                                <w:color w:val="FFFFFF" w:themeColor="background1"/>
+                                <w:sz w:val="24"/>
+                                <w:szCs w:val="24"/>
+                                <w:lang w:val="en-US"/>
+                              </w:rPr>
+                              <w:t>Volders</w:t>
+                            </w:r>
+                            <w:proofErr w:type="spellEnd"/>
+                            <w:r>
+                              <w:rPr>
+                                <w:b/>
+                                <w:bCs/>
+                                <w:color w:val="FFFFFF" w:themeColor="background1"/>
+                                <w:sz w:val="24"/>
+                                <w:szCs w:val="24"/>
+                                <w:lang w:val="en-US"/>
+                              </w:rPr>
+                              <w:t xml:space="preserve"> </w:t>
                             </w:r>
                           </w:p>
                           <w:p>
@@ -604,6 +907,69 @@
                                 <w:color w:val="FFFFFF" w:themeColor="background1"/>
                                 <w:sz w:val="24"/>
                                 <w:szCs w:val="24"/>
+                                <w:lang w:val="en-US"/>
+                              </w:rPr>
+                            </w:pPr>
+                            <w:proofErr w:type="spellStart"/>
+                            <w:r>
+                              <w:rPr>
+                                <w:b/>
+                                <w:bCs/>
+                                <w:color w:val="FFFFFF" w:themeColor="background1"/>
+                                <w:sz w:val="24"/>
+                                <w:szCs w:val="24"/>
+                                <w:lang w:val="en-US"/>
+                              </w:rPr>
+                              <w:t>Eerste</w:t>
+                            </w:r>
+                            <w:proofErr w:type="spellEnd"/>
+                            <w:r>
+                              <w:rPr>
+                                <w:b/>
+                                <w:bCs/>
+                                <w:color w:val="FFFFFF" w:themeColor="background1"/>
+                                <w:sz w:val="24"/>
+                                <w:szCs w:val="24"/>
+                                <w:lang w:val="en-US"/>
+                              </w:rPr>
+                              <w:t xml:space="preserve"> </w:t>
+                            </w:r>
+                            <w:proofErr w:type="spellStart"/>
+                            <w:r>
+                              <w:rPr>
+                                <w:b/>
+                                <w:bCs/>
+                                <w:color w:val="FFFFFF" w:themeColor="background1"/>
+                                <w:sz w:val="24"/>
+                                <w:szCs w:val="24"/>
+                                <w:lang w:val="en-US"/>
+                              </w:rPr>
+                              <w:t>gelegenheid</w:t>
+                            </w:r>
+                            <w:proofErr w:type="spellEnd"/>
+                            <w:r>
+                              <w:rPr>
+                                <w:b/>
+                                <w:bCs/>
+                                <w:color w:val="FFFFFF" w:themeColor="background1"/>
+                                <w:sz w:val="24"/>
+                                <w:szCs w:val="24"/>
+                                <w:lang w:val="en-US"/>
+                              </w:rPr>
+                              <w:t xml:space="preserve"> </w:t>
+                            </w:r>
+                          </w:p>
+                          <w:p>
+                            <w:pPr>
+                              <w:pStyle w:val="Geenafstand"/>
+                              <w:spacing w:line="276" w:lineRule="auto"/>
+                              <w:rPr>
+                                <w:b/>
+                                <w:bCs/>
+                                <w:color w:val="FFFFFF" w:themeColor="background1"/>
+                                <w:sz w:val="24"/>
+                                <w:szCs w:val="24"/>
+                                <w:lang w:val="en-US"/>
                               </w:rPr>
                             </w:pPr>
                             <w:r>
@@ -613,8 +979,9 @@
                                 <w:color w:val="FFFFFF" w:themeColor="background1"/>
                                 <w:sz w:val="24"/>
                                 <w:szCs w:val="24"/>
+                                <w:lang w:val="en-US"/>
                               </w:rPr>
-                              <w:t>13/02/2026</w:t>
+                              <w:t>7/6/2026</w:t>
                             </w:r>
                           </w:p>
                         </w:txbxContent>
@@ -626,16 +993,49 @@
               </mc:Fallback>
             </mc:AlternateContent>
           </w:r>
+          <w:r>
+            <w:rPr>
+              <w:sz w:val="44"/>
+              <w:szCs w:val="44"/>
+            </w:rPr>
+            <w:t xml:space="preserve">Object Detection Model </w:t>
+          </w:r>
+        </w:p>
+        <w:p>
+          <w:pPr>
+            <w:rPr>
+              <w:sz w:val="44"/>
+              <w:szCs w:val="44"/>
+            </w:rPr>
+          </w:pPr>
+          <w:r>
+            <w:rPr>
+              <w:sz w:val="44"/>
+              <w:szCs w:val="44"/>
+            </w:rPr>
+            <w:t>Liter</w:t>
+          </w:r>
+          <w:r>
+            <w:rPr>
+              <w:sz w:val="44"/>
+              <w:szCs w:val="44"/>
+            </w:rPr>
+            <w:t>ature Research</w:t>
+          </w:r>
+          <w:r>
+            <w:rPr>
+              <w:sz w:val="44"/>
+              <w:szCs w:val="44"/>
+            </w:rPr>
+            <w:t xml:space="preserve"> Rapport</w:t>
+          </w:r>
         </w:p>
         <w:p>
           <w:r>
-            <w:rPr>
-              <w:noProof/>
-            </w:rPr>
             <mc:AlternateContent>
               <mc:Choice Requires="wps">
                 <w:drawing>
-                  <wp:anchor distT="0" distB="0" distL="114300" distR="114300" simplePos="0" relativeHeight="251660288" behindDoc="0" locked="0" layoutInCell="0" allowOverlap="1" wp14:anchorId="32C66368" wp14:editId="7FE04DF7">
+                  <wp:anchor distT="0" distB="0" distL="114300" distR="114300" simplePos="0" relativeHeight="251660288" behindDoc="0" locked="0" layoutInCell="0" allowOverlap="1" wp14:anchorId="3A462953" wp14:editId="3A462954">
                     <wp:simplePos x="0" y="0"/>
                     <wp:positionH relativeFrom="page">
                       <wp:align>left</wp:align>
@@ -686,6 +1086,7 @@
                                     <w:color w:val="FFFFFF" w:themeColor="background1"/>
                                     <w:sz w:val="72"/>
                                     <w:szCs w:val="72"/>
+                                    <w:lang w:val="en-US"/>
                                   </w:rPr>
                                 </w:pPr>
                                 <w:r>
@@ -693,6 +1094,7 @@
                                     <w:color w:val="FFFFFF" w:themeColor="background1"/>
                                     <w:sz w:val="72"/>
                                     <w:szCs w:val="72"/>
+                                    <w:lang w:val="en-US"/>
                                   </w:rPr>
                                   <w:t>-</w:t>
                                 </w:r>
@@ -716,7 +1118,7 @@
               </mc:Choice>
               <mc:Fallback>
                 <w:pict>
-                  <v:rect w14:anchorId="32C66368" id="Rechthoek 16" o:spid="_x0000_s1031" style="position:absolute;margin-left:0;margin-top:204pt;width:756.4pt;height:52.65pt;z-index:251660288;visibility:visible;mso-wrap-style:square;mso-width-percent:900;mso-height-percent:73;mso-wrap-distance-left:9pt;mso-wrap-distance-top:0;mso-wrap-distance-right:9pt;mso-wrap-distance-bottom:0;mso-position-horizontal:left;mso-position-horizontal-relative:page;mso-position-vertical:absolute;mso-position-vertical-relative:page;mso-width-percent:900;mso-height-percent:73;mso-width-relative:page;mso-height-relative:page;v-text-anchor:middle" o:gfxdata="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" o:allowincell="f" fillcolor="black [3213]" strokecolor="black [3213]" strokeweight="1.5pt">
+                  <v:rect w14:anchorId="3A462953" id="Rechthoek 16" o:spid="_x0000_s1031" style="position:absolute;margin-left:0;margin-top:204pt;width:756.4pt;height:52.65pt;z-index:251660288;visibility:visible;mso-wrap-style:square;mso-width-percent:900;mso-height-percent:73;mso-wrap-distance-left:9pt;mso-wrap-distance-top:0;mso-wrap-distance-right:9pt;mso-wrap-distance-bottom:0;mso-position-horizontal:left;mso-position-horizontal-relative:page;mso-position-vertical:absolute;mso-position-vertical-relative:page;mso-width-percent:900;mso-height-percent:73;mso-width-relative:page;mso-height-relative:page;v-text-anchor:middle" o:gfxdata="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" o:allowincell="f" fillcolor="black [3213]" strokecolor="black [3213]" strokeweight="1.5pt">
                     <v:textbox style="mso-fit-shape-to-text:t" inset="14.4pt,,14.4pt">
                       <w:txbxContent>
                         <w:p>
@@ -727,6 +1129,7 @@
                               <w:color w:val="FFFFFF" w:themeColor="background1"/>
                               <w:sz w:val="72"/>
                               <w:szCs w:val="72"/>
+                              <w:lang w:val="en-US"/>
                             </w:rPr>
                           </w:pPr>
                           <w:r>
@@ -734,6 +1137,7 @@
                               <w:color w:val="FFFFFF" w:themeColor="background1"/>
                               <w:sz w:val="72"/>
                               <w:szCs w:val="72"/>
+                              <w:lang w:val="en-US"/>
                             </w:rPr>
                             <w:t>-</w:t>
                           </w:r>
@@ -752,7 +1156,2076 @@
         </w:p>
       </w:sdtContent>
     </w:sdt>
-    <w:bookmarkEnd w:id="0"/>
+    <w:bookmarkEnd w:id="0" w:displacedByCustomXml="next"/>
+    <w:sdt>
+      <w:sdtPr>
+        <w:rPr>
+          <w:rFonts w:asciiTheme="minorHAnsi" w:eastAsiaTheme="minorHAnsi" w:hAnsiTheme="minorHAnsi" w:cstheme="minorBidi"/>
+          <w:color w:val="auto"/>
+          <w:kern w:val="2"/>
+          <w:sz w:val="22"/>
+          <w:szCs w:val="22"/>
+          <w:lang w:eastAsia="en-US"/>
+          <w14:ligatures w14:val="standardContextual"/>
+        </w:rPr>
+        <w:id w:val="-1637863464"/>
+        <w:docPartObj>
+          <w:docPartGallery w:val="Table of Contents"/>
+          <w:docPartUnique/>
+        </w:docPartObj>
+      </w:sdtPr>
+      <w:sdtEndPr>
+        <w:rPr>
+          <w:b/>
+          <w:bCs/>
+        </w:rPr>
+      </w:sdtEndPr>
+      <w:sdtContent>
+        <w:p>
+          <w:pPr>
+            <w:pStyle w:val="Kopvaninhoudsopgave"/>
+          </w:pPr>
+          <w:r>
+            <w:t>Table of Contents</w:t>
+          </w:r>
+        </w:p>
+        <w:p>
+          <w:pPr>
+            <w:pStyle w:val="Inhopg2"/>
+            <w:tabs>
+              <w:tab w:val="right" w:leader="dot" w:pos="9062"/>
+            </w:tabs>
+            <w:rPr>
+              <w:rFonts w:eastAsiaTheme="minorEastAsia"/>
+              <w:sz w:val="24"/>
+              <w:szCs w:val="24"/>
+              <w:lang w:eastAsia="ko-KR"/>
+            </w:rPr>
+          </w:pPr>
+          <w:r>
+            <w:fldChar w:fldCharType="begin"/>
+          </w:r>
+          <w:r>
+            <w:instrText xml:space="preserve"> TOC \o "1-3" \h \z \u </w:instrText>
+          </w:r>
+          <w:r>
+            <w:fldChar w:fldCharType="separate"/>
+          </w:r>
+          <w:hyperlink w:anchor="_Toc222405883" w:history="1">
+            <w:r>
+              <w:rPr>
+                <w:rStyle w:val="Hyperlink"/>
+              </w:rPr>
+              <w:t>Summary</w:t>
+            </w:r>
+            <w:r>
+              <w:rPr>
+                <w:webHidden/>
+              </w:rPr>
+              <w:tab/>
+            </w:r>
+            <w:r>
+              <w:rPr>
+                <w:webHidden/>
+              </w:rPr>
+              <w:fldChar w:fldCharType="begin"/>
+            </w:r>
+            <w:r>
+              <w:rPr>
+                <w:webHidden/>
+              </w:rPr>
+              <w:instrText xml:space="preserve"> PAGEREF _Toc222405883 \h </w:instrText>
+            </w:r>
+            <w:r>
+              <w:rPr>
+                <w:webHidden/>
+              </w:rPr>
+            </w:r>
+            <w:r>
+              <w:rPr>
+                <w:webHidden/>
+              </w:rPr>
+              <w:fldChar w:fldCharType="separate"/>
+            </w:r>
+            <w:r>
+              <w:rPr>
+                <w:webHidden/>
+              </w:rPr>
+              <w:t>2</w:t>
+            </w:r>
+            <w:r>
+              <w:rPr>
+                <w:webHidden/>
+              </w:rPr>
+              <w:fldChar w:fldCharType="end"/>
+            </w:r>
+          </w:hyperlink>
+        </w:p>
+        <w:p>
+          <w:pPr>
+            <w:pStyle w:val="Inhopg2"/>
+            <w:tabs>
+              <w:tab w:val="right" w:leader="dot" w:pos="9062"/>
+            </w:tabs>
+            <w:rPr>
+              <w:rFonts w:eastAsiaTheme="minorEastAsia"/>
+              <w:sz w:val="24"/>
+              <w:szCs w:val="24"/>
+              <w:lang w:eastAsia="ko-KR"/>
+            </w:rPr>
+          </w:pPr>
+          <w:hyperlink w:anchor="_Toc222405884" w:history="1">
+            <w:r>
+              <w:rPr>
+                <w:rStyle w:val="Hyperlink"/>
+              </w:rPr>
+              <w:t>Introduction</w:t>
+            </w:r>
+            <w:r>
+              <w:rPr>
+                <w:webHidden/>
+              </w:rPr>
+              <w:tab/>
+            </w:r>
+            <w:r>
+              <w:rPr>
+                <w:webHidden/>
+              </w:rPr>
+              <w:fldChar w:fldCharType="begin"/>
+            </w:r>
+            <w:r>
+              <w:rPr>
+                <w:webHidden/>
+              </w:rPr>
+              <w:instrText xml:space="preserve"> PAGEREF _Toc222405884 \h </w:instrText>
+            </w:r>
+            <w:r>
+              <w:rPr>
+                <w:webHidden/>
+              </w:rPr>
+            </w:r>
+            <w:r>
+              <w:rPr>
+                <w:webHidden/>
+              </w:rPr>
+              <w:fldChar w:fldCharType="separate"/>
+            </w:r>
+            <w:r>
+              <w:rPr>
+                <w:webHidden/>
+              </w:rPr>
+              <w:t>2</w:t>
+            </w:r>
+            <w:r>
+              <w:rPr>
+                <w:webHidden/>
+              </w:rPr>
+              <w:fldChar w:fldCharType="end"/>
+            </w:r>
+          </w:hyperlink>
+        </w:p>
+        <w:p>
+          <w:pPr>
+            <w:pStyle w:val="Inhopg2"/>
+            <w:tabs>
+              <w:tab w:val="right" w:leader="dot" w:pos="9062"/>
+            </w:tabs>
+            <w:rPr>
+              <w:rFonts w:eastAsiaTheme="minorEastAsia"/>
+              <w:sz w:val="24"/>
+              <w:szCs w:val="24"/>
+              <w:lang w:eastAsia="ko-KR"/>
+            </w:rPr>
+          </w:pPr>
+          <w:hyperlink w:anchor="_Toc222405885" w:history="1">
+            <w:r>
+              <w:rPr>
+                <w:rStyle w:val="Hyperlink"/>
+              </w:rPr>
+              <w:t>Method</w:t>
+            </w:r>
+            <w:r>
+              <w:rPr>
+                <w:webHidden/>
+              </w:rPr>
+              <w:tab/>
+            </w:r>
+            <w:r>
+              <w:rPr>
+                <w:webHidden/>
+              </w:rPr>
+              <w:fldChar w:fldCharType="begin"/>
+            </w:r>
+            <w:r>
+              <w:rPr>
+                <w:webHidden/>
+              </w:rPr>
+              <w:instrText xml:space="preserve"> PAGEREF _Toc222405885 \h </w:instrText>
+            </w:r>
+            <w:r>
+              <w:rPr>
+                <w:webHidden/>
+              </w:rPr>
+            </w:r>
+            <w:r>
+              <w:rPr>
+                <w:webHidden/>
+              </w:rPr>
+              <w:fldChar w:fldCharType="separate"/>
+            </w:r>
+            <w:r>
+              <w:rPr>
+                <w:webHidden/>
+              </w:rPr>
+              <w:t>2</w:t>
+            </w:r>
+            <w:r>
+              <w:rPr>
+                <w:webHidden/>
+              </w:rPr>
+              <w:fldChar w:fldCharType="end"/>
+            </w:r>
+          </w:hyperlink>
+        </w:p>
+        <w:p>
+          <w:pPr>
+            <w:pStyle w:val="Inhopg2"/>
+            <w:tabs>
+              <w:tab w:val="right" w:leader="dot" w:pos="9062"/>
+            </w:tabs>
+            <w:rPr>
+              <w:rFonts w:eastAsiaTheme="minorEastAsia"/>
+              <w:sz w:val="24"/>
+              <w:szCs w:val="24"/>
+              <w:lang w:eastAsia="ko-KR"/>
+            </w:rPr>
+          </w:pPr>
+          <w:hyperlink w:anchor="_Toc222405886" w:history="1">
+            <w:r>
+              <w:rPr>
+                <w:rStyle w:val="Hyperlink"/>
+              </w:rPr>
+              <w:t>Results</w:t>
+            </w:r>
+            <w:r>
+              <w:rPr>
+                <w:webHidden/>
+              </w:rPr>
+              <w:tab/>
+            </w:r>
+            <w:r>
+              <w:rPr>
+                <w:webHidden/>
+              </w:rPr>
+              <w:fldChar w:fldCharType="begin"/>
+            </w:r>
+            <w:r>
+              <w:rPr>
+                <w:webHidden/>
+              </w:rPr>
+              <w:instrText xml:space="preserve"> PAGEREF _Toc222405886 \h </w:instrText>
+            </w:r>
+            <w:r>
+              <w:rPr>
+                <w:webHidden/>
+              </w:rPr>
+            </w:r>
+            <w:r>
+              <w:rPr>
+                <w:webHidden/>
+              </w:rPr>
+              <w:fldChar w:fldCharType="separate"/>
+            </w:r>
+            <w:r>
+              <w:rPr>
+                <w:webHidden/>
+              </w:rPr>
+              <w:t>3</w:t>
+            </w:r>
+            <w:r>
+              <w:rPr>
+                <w:webHidden/>
+              </w:rPr>
+              <w:fldChar w:fldCharType="end"/>
+            </w:r>
+          </w:hyperlink>
+        </w:p>
+        <w:p>
+          <w:pPr>
+            <w:pStyle w:val="Inhopg2"/>
+            <w:tabs>
+              <w:tab w:val="right" w:leader="dot" w:pos="9062"/>
+            </w:tabs>
+            <w:rPr>
+              <w:rFonts w:eastAsiaTheme="minorEastAsia"/>
+              <w:sz w:val="24"/>
+              <w:szCs w:val="24"/>
+              <w:lang w:eastAsia="ko-KR"/>
+            </w:rPr>
+          </w:pPr>
+          <w:hyperlink w:anchor="_Toc222405887" w:history="1">
+            <w:r>
+              <w:rPr>
+                <w:rStyle w:val="Hyperlink"/>
+              </w:rPr>
+              <w:t>Conclusion</w:t>
+            </w:r>
+            <w:r>
+              <w:rPr>
+                <w:webHidden/>
+              </w:rPr>
+              <w:tab/>
+            </w:r>
+            <w:r>
+              <w:rPr>
+                <w:webHidden/>
+              </w:rPr>
+              <w:fldChar w:fldCharType="begin"/>
+            </w:r>
+            <w:r>
+              <w:rPr>
+                <w:webHidden/>
+              </w:rPr>
+              <w:instrText xml:space="preserve"> PAGEREF _Toc222405887 \h </w:instrText>
+            </w:r>
+            <w:r>
+              <w:rPr>
+                <w:webHidden/>
+              </w:rPr>
+            </w:r>
+            <w:r>
+              <w:rPr>
+                <w:webHidden/>
+              </w:rPr>
+              <w:fldChar w:fldCharType="separate"/>
+            </w:r>
+            <w:r>
+              <w:rPr>
+                <w:webHidden/>
+              </w:rPr>
+              <w:t>3</w:t>
+            </w:r>
+            <w:r>
+              <w:rPr>
+                <w:webHidden/>
+              </w:rPr>
+              <w:fldChar w:fldCharType="end"/>
+            </w:r>
+          </w:hyperlink>
+        </w:p>
+        <w:p>
+          <w:pPr>
+            <w:pStyle w:val="Inhopg2"/>
+            <w:tabs>
+              <w:tab w:val="right" w:leader="dot" w:pos="9062"/>
+            </w:tabs>
+            <w:rPr>
+              <w:rFonts w:eastAsiaTheme="minorEastAsia"/>
+              <w:sz w:val="24"/>
+              <w:szCs w:val="24"/>
+              <w:lang w:eastAsia="ko-KR"/>
+            </w:rPr>
+          </w:pPr>
+          <w:hyperlink w:anchor="_Toc222405888" w:history="1">
+            <w:r>
+              <w:rPr>
+                <w:rStyle w:val="Hyperlink"/>
+              </w:rPr>
+              <w:t>Sources</w:t>
+            </w:r>
+            <w:r>
+              <w:rPr>
+                <w:webHidden/>
+              </w:rPr>
+              <w:tab/>
+            </w:r>
+            <w:r>
+              <w:rPr>
+                <w:webHidden/>
+              </w:rPr>
+              <w:fldChar w:fldCharType="begin"/>
+            </w:r>
+            <w:r>
+              <w:rPr>
+                <w:webHidden/>
+              </w:rPr>
+              <w:instrText xml:space="preserve"> PAGEREF _Toc222405888 \h </w:instrText>
+            </w:r>
+            <w:r>
+              <w:rPr>
+                <w:webHidden/>
+              </w:rPr>
+            </w:r>
+            <w:r>
+              <w:rPr>
+                <w:webHidden/>
+              </w:rPr>
+              <w:fldChar w:fldCharType="separate"/>
+            </w:r>
+            <w:r>
+              <w:rPr>
+                <w:webHidden/>
+              </w:rPr>
+              <w:t>3</w:t>
+            </w:r>
+            <w:r>
+              <w:rPr>
+                <w:webHidden/>
+              </w:rPr>
+              <w:fldChar w:fldCharType="end"/>
+            </w:r>
+          </w:hyperlink>
+        </w:p>
+        <w:p>
+          <w:pPr>
+            <w:pStyle w:val="Inhopg2"/>
+            <w:tabs>
+              <w:tab w:val="right" w:leader="dot" w:pos="9062"/>
+            </w:tabs>
+            <w:rPr>
+              <w:rFonts w:eastAsiaTheme="minorEastAsia"/>
+              <w:sz w:val="24"/>
+              <w:szCs w:val="24"/>
+              <w:lang w:eastAsia="ko-KR"/>
+            </w:rPr>
+          </w:pPr>
+          <w:hyperlink w:anchor="_Toc222405889" w:history="1">
+            <w:r>
+              <w:rPr>
+                <w:rStyle w:val="Hyperlink"/>
+              </w:rPr>
+              <w:t>Changelog</w:t>
+            </w:r>
+            <w:r>
+              <w:rPr>
+                <w:webHidden/>
+              </w:rPr>
+              <w:tab/>
+            </w:r>
+            <w:r>
+              <w:rPr>
+                <w:webHidden/>
+              </w:rPr>
+              <w:fldChar w:fldCharType="begin"/>
+            </w:r>
+            <w:r>
+              <w:rPr>
+                <w:webHidden/>
+              </w:rPr>
+              <w:instrText xml:space="preserve"> PAGEREF _Toc222405889 \h </w:instrText>
+            </w:r>
+            <w:r>
+              <w:rPr>
+                <w:webHidden/>
+              </w:rPr>
+            </w:r>
+            <w:r>
+              <w:rPr>
+                <w:webHidden/>
+              </w:rPr>
+              <w:fldChar w:fldCharType="separate"/>
+            </w:r>
+            <w:r>
+              <w:rPr>
+                <w:webHidden/>
+              </w:rPr>
+              <w:t>3</w:t>
+            </w:r>
+            <w:r>
+              <w:rPr>
+                <w:webHidden/>
+              </w:rPr>
+              <w:fldChar w:fldCharType="end"/>
+            </w:r>
+          </w:hyperlink>
+        </w:p>
+        <w:p>
+          <w:r>
+            <w:rPr>
+              <w:b/>
+              <w:bCs/>
+            </w:rPr>
+            <w:fldChar w:fldCharType="end"/>
+          </w:r>
+        </w:p>
+      </w:sdtContent>
+    </w:sdt>
+    <w:p>
+      <w:pPr>
+        <w:pStyle w:val="Kop2"/>
+      </w:pPr>
+    </w:p>
+    <w:p>
+      <w:pPr>
+        <w:pStyle w:val="Kop2"/>
+      </w:pPr>
+      <w:bookmarkStart w:id="1" w:name="_Toc222405883"/>
+      <w:r>
+        <w:t>Summary</w:t>
+      </w:r>
+      <w:bookmarkEnd w:id="1"/>
+    </w:p>
+    <w:p>
+      <w:pPr>
+        <w:rPr>
+          <w:sz w:val="24"/>
+          <w:szCs w:val="24"/>
+        </w:rPr>
+      </w:pPr>
+    </w:p>
+    <w:p>
+      <w:pPr>
+        <w:rPr>
+          <w:sz w:val="24"/>
+          <w:szCs w:val="24"/>
+        </w:rPr>
+      </w:pPr>
+    </w:p>
+    <w:p>
+      <w:pPr>
+        <w:pStyle w:val="Kop2"/>
+      </w:pPr>
+      <w:bookmarkStart w:id="2" w:name="_Toc222405884"/>
+      <w:r>
+        <w:t>In</w:t>
+      </w:r>
+      <w:r>
+        <w:t>troduction</w:t>
+      </w:r>
+      <w:bookmarkEnd w:id="2"/>
+    </w:p>
+    <w:p>
+      <w:pPr>
+        <w:rPr>
+          <w:sz w:val="24"/>
+          <w:szCs w:val="24"/>
+        </w:rPr>
+      </w:pPr>
+      <w:r>
+        <w:rPr>
+          <w:sz w:val="24"/>
+          <w:szCs w:val="24"/>
+        </w:rPr>
+        <w:t xml:space="preserve">Our project is </w:t>
+      </w:r>
+      <w:r>
+        <w:rPr>
+          <w:sz w:val="24"/>
+          <w:szCs w:val="24"/>
+        </w:rPr>
+        <w:t>the development of</w:t>
+      </w:r>
+      <w:r>
+        <w:rPr>
+          <w:sz w:val="24"/>
+          <w:szCs w:val="24"/>
+        </w:rPr>
+        <w:t xml:space="preserve"> </w:t>
+      </w:r>
+      <w:r>
+        <w:rPr>
+          <w:sz w:val="24"/>
+          <w:szCs w:val="24"/>
+        </w:rPr>
+        <w:t>software to make a small kart drive autonomously.</w:t>
+      </w:r>
+      <w:r>
+        <w:rPr>
+          <w:sz w:val="24"/>
+          <w:szCs w:val="24"/>
+        </w:rPr>
+        <w:t xml:space="preserve"> </w:t>
+      </w:r>
+      <w:r>
+        <w:rPr>
+          <w:sz w:val="24"/>
+          <w:szCs w:val="24"/>
+        </w:rPr>
+        <w:t>This is for the SDC (Self-Driving-Challenge) provided by the RDW</w:t>
+      </w:r>
+      <w:r>
+        <w:rPr>
+          <w:sz w:val="24"/>
+          <w:szCs w:val="24"/>
+        </w:rPr>
+        <w:t xml:space="preserve"> (</w:t>
+      </w:r>
+      <w:proofErr w:type="spellStart"/>
+      <w:r>
+        <w:rPr>
+          <w:sz w:val="24"/>
+          <w:szCs w:val="24"/>
+        </w:rPr>
+        <w:t>Rijksdiest</w:t>
+      </w:r>
+      <w:proofErr w:type="spellEnd"/>
+      <w:r>
+        <w:rPr>
+          <w:sz w:val="24"/>
+          <w:szCs w:val="24"/>
+        </w:rPr>
+        <w:t xml:space="preserve"> </w:t>
+      </w:r>
+      <w:proofErr w:type="spellStart"/>
+      <w:r>
+        <w:rPr>
+          <w:sz w:val="24"/>
+          <w:szCs w:val="24"/>
+        </w:rPr>
+        <w:t>voor</w:t>
+      </w:r>
+      <w:proofErr w:type="spellEnd"/>
+      <w:r>
+        <w:rPr>
+          <w:sz w:val="24"/>
+          <w:szCs w:val="24"/>
+        </w:rPr>
+        <w:t xml:space="preserve"> het </w:t>
+      </w:r>
+      <w:proofErr w:type="spellStart"/>
+      <w:r>
+        <w:rPr>
+          <w:sz w:val="24"/>
+          <w:szCs w:val="24"/>
+        </w:rPr>
+        <w:t>Wegverkeer</w:t>
+      </w:r>
+      <w:proofErr w:type="spellEnd"/>
+      <w:r>
+        <w:rPr>
+          <w:sz w:val="24"/>
+          <w:szCs w:val="24"/>
+        </w:rPr>
+        <w:t>)</w:t>
+      </w:r>
+      <w:r>
+        <w:rPr>
+          <w:sz w:val="24"/>
+          <w:szCs w:val="24"/>
+        </w:rPr>
+        <w:t xml:space="preserve"> to give them more insight into how self-driving vehicles work, since </w:t>
+      </w:r>
+      <w:r>
+        <w:rPr>
+          <w:sz w:val="24"/>
+          <w:szCs w:val="24"/>
+        </w:rPr>
+        <w:t xml:space="preserve">some of the car companies developing </w:t>
+      </w:r>
+      <w:r>
+        <w:rPr>
+          <w:sz w:val="24"/>
+          <w:szCs w:val="24"/>
+        </w:rPr>
+        <w:t xml:space="preserve">this software </w:t>
+      </w:r>
+      <w:r>
+        <w:rPr>
+          <w:sz w:val="24"/>
+          <w:szCs w:val="24"/>
+        </w:rPr>
+        <w:t>don’t want to give away their development procedures.</w:t>
+      </w:r>
+    </w:p>
+    <w:p>
+      <w:pPr>
+        <w:rPr>
+          <w:sz w:val="24"/>
+          <w:szCs w:val="24"/>
+        </w:rPr>
+      </w:pPr>
+      <w:r>
+        <w:rPr>
+          <w:sz w:val="24"/>
+          <w:szCs w:val="24"/>
+        </w:rPr>
+        <w:t xml:space="preserve">To do this it must detect things that are on the road ahead of it, these things include: People, </w:t>
+      </w:r>
+      <w:r>
+        <w:rPr>
+          <w:sz w:val="24"/>
+          <w:szCs w:val="24"/>
+        </w:rPr>
+        <w:t xml:space="preserve">Cars, </w:t>
+      </w:r>
+      <w:r>
+        <w:rPr>
+          <w:sz w:val="24"/>
+          <w:szCs w:val="24"/>
+        </w:rPr>
+        <w:t xml:space="preserve">Traffic Signs and </w:t>
+      </w:r>
+      <w:r>
+        <w:rPr>
+          <w:sz w:val="24"/>
+          <w:szCs w:val="24"/>
+        </w:rPr>
+        <w:t>Traffic Lights.</w:t>
+      </w:r>
+      <w:r>
+        <w:rPr>
+          <w:sz w:val="24"/>
+          <w:szCs w:val="24"/>
+        </w:rPr>
+        <w:t xml:space="preserve"> The Detection will be done through camera’s and an Object Detection Model</w:t>
+      </w:r>
+      <w:r>
+        <w:rPr>
+          <w:sz w:val="24"/>
+          <w:szCs w:val="24"/>
+        </w:rPr>
+        <w:t xml:space="preserve">, but then the question is: Which Object Detection </w:t>
+      </w:r>
+      <w:r>
+        <w:rPr>
+          <w:sz w:val="24"/>
+          <w:szCs w:val="24"/>
+        </w:rPr>
+        <w:t>is the most applicable</w:t>
+      </w:r>
+      <w:r>
+        <w:rPr>
+          <w:sz w:val="24"/>
+          <w:szCs w:val="24"/>
+        </w:rPr>
+        <w:t>? That is the question that will be cover</w:t>
+      </w:r>
+      <w:r>
+        <w:rPr>
+          <w:sz w:val="24"/>
+          <w:szCs w:val="24"/>
+        </w:rPr>
+        <w:t>ed in this rapport.</w:t>
+      </w:r>
+    </w:p>
+    <w:p>
+      <w:pPr>
+        <w:rPr>
+          <w:sz w:val="24"/>
+          <w:szCs w:val="24"/>
+        </w:rPr>
+      </w:pPr>
+    </w:p>
+    <w:p>
+      <w:pPr>
+        <w:rPr>
+          <w:rFonts w:asciiTheme="majorHAnsi" w:eastAsiaTheme="majorEastAsia" w:hAnsiTheme="majorHAnsi" w:cstheme="majorBidi"/>
+          <w:color w:val="0F4761" w:themeColor="accent1" w:themeShade="BF"/>
+          <w:sz w:val="32"/>
+          <w:szCs w:val="32"/>
+        </w:rPr>
+      </w:pPr>
+      <w:bookmarkStart w:id="3" w:name="_Toc222405885"/>
+      <w:r>
+        <w:br w:type="page"/>
+      </w:r>
+    </w:p>
+    <w:p>
+      <w:pPr>
+        <w:pStyle w:val="Kop2"/>
+      </w:pPr>
+      <w:r>
+        <w:lastRenderedPageBreak/>
+        <w:t>Method</w:t>
+      </w:r>
+      <w:bookmarkEnd w:id="3"/>
+    </w:p>
+    <w:p>
+      <w:pPr>
+        <w:rPr>
+          <w:sz w:val="24"/>
+          <w:szCs w:val="24"/>
+        </w:rPr>
+      </w:pPr>
+      <w:r>
+        <w:rPr>
+          <w:sz w:val="24"/>
+          <w:szCs w:val="24"/>
+        </w:rPr>
+        <w:t>The Research method of this rapport</w:t>
+      </w:r>
+      <w:r>
+        <w:rPr>
+          <w:sz w:val="24"/>
+          <w:szCs w:val="24"/>
+        </w:rPr>
+        <w:t xml:space="preserve"> is liter</w:t>
+      </w:r>
+      <w:r>
+        <w:rPr>
+          <w:sz w:val="24"/>
+          <w:szCs w:val="24"/>
+        </w:rPr>
+        <w:t xml:space="preserve">ary research. That means that this rapport will be done through sources of the documentation of various </w:t>
+      </w:r>
+      <w:r>
+        <w:rPr>
+          <w:sz w:val="24"/>
+          <w:szCs w:val="24"/>
+        </w:rPr>
+        <w:t>different models types</w:t>
+      </w:r>
+      <w:r>
+        <w:rPr>
+          <w:sz w:val="24"/>
+          <w:szCs w:val="24"/>
+        </w:rPr>
+        <w:t>.</w:t>
+      </w:r>
+    </w:p>
+    <w:p>
+      <w:pPr>
+        <w:rPr>
+          <w:sz w:val="24"/>
+          <w:szCs w:val="24"/>
+        </w:rPr>
+      </w:pPr>
+      <w:r>
+        <w:rPr>
+          <w:sz w:val="24"/>
+          <w:szCs w:val="24"/>
+        </w:rPr>
+        <w:t>There are also some requirements for choosing the right/most applicable detection model:</w:t>
+      </w:r>
+    </w:p>
+    <w:p>
+      <w:pPr>
+        <w:pStyle w:val="Lijstalinea"/>
+        <w:numPr>
+          <w:ilvl w:val="0"/>
+          <w:numId w:val="1"/>
+        </w:numPr>
+        <w:rPr>
+          <w:sz w:val="24"/>
+          <w:szCs w:val="24"/>
+        </w:rPr>
+      </w:pPr>
+      <w:r>
+        <w:rPr>
+          <w:sz w:val="24"/>
+          <w:szCs w:val="24"/>
+        </w:rPr>
+        <w:t>Latency; the model has to work mostly in real time (</w:t>
+      </w:r>
+      <w:r>
+        <w:rPr>
+          <w:sz w:val="24"/>
+          <w:szCs w:val="24"/>
+        </w:rPr>
+        <w:t>&lt;= 1 second)</w:t>
+      </w:r>
+      <w:r>
+        <w:rPr>
+          <w:sz w:val="24"/>
+          <w:szCs w:val="24"/>
+        </w:rPr>
+        <w:t>.</w:t>
+      </w:r>
+      <w:r>
+        <w:rPr>
+          <w:sz w:val="24"/>
+          <w:szCs w:val="24"/>
+        </w:rPr>
+        <w:t xml:space="preserve"> </w:t>
+      </w:r>
+    </w:p>
+    <w:p>
+      <w:pPr>
+        <w:pStyle w:val="Lijstalinea"/>
+        <w:numPr>
+          <w:ilvl w:val="0"/>
+          <w:numId w:val="1"/>
+        </w:numPr>
+        <w:rPr>
+          <w:sz w:val="24"/>
+          <w:szCs w:val="24"/>
+        </w:rPr>
+      </w:pPr>
+      <w:r>
+        <w:rPr>
+          <w:sz w:val="24"/>
+          <w:szCs w:val="24"/>
+        </w:rPr>
+        <w:t xml:space="preserve">Accuracy; the model has to be </w:t>
+      </w:r>
+      <w:r>
+        <w:rPr>
+          <w:sz w:val="24"/>
+          <w:szCs w:val="24"/>
+        </w:rPr>
+        <w:t>able to reliably detect objects</w:t>
+      </w:r>
+      <w:r>
+        <w:rPr>
+          <w:sz w:val="24"/>
+          <w:szCs w:val="24"/>
+        </w:rPr>
+        <w:t xml:space="preserve"> and has to work on smaller/further objects</w:t>
+      </w:r>
+      <w:r>
+        <w:rPr>
+          <w:sz w:val="24"/>
+          <w:szCs w:val="24"/>
+        </w:rPr>
+        <w:t>.</w:t>
+      </w:r>
+    </w:p>
+    <w:p>
+      <w:pPr>
+        <w:pStyle w:val="Lijstalinea"/>
+        <w:numPr>
+          <w:ilvl w:val="0"/>
+          <w:numId w:val="1"/>
+        </w:numPr>
+        <w:rPr>
+          <w:sz w:val="24"/>
+          <w:szCs w:val="24"/>
+        </w:rPr>
+      </w:pPr>
+      <w:r>
+        <w:rPr>
+          <w:sz w:val="24"/>
+          <w:szCs w:val="24"/>
+        </w:rPr>
+        <w:t xml:space="preserve">Load; the model has to remain lightweight. </w:t>
+      </w:r>
+      <w:r>
+        <w:rPr>
+          <w:sz w:val="24"/>
+          <w:szCs w:val="24"/>
+        </w:rPr>
+        <w:t>The heavier models increase CPU usage, which can cause frame-skipping, which in turn can cause missed detections.</w:t>
+      </w:r>
+    </w:p>
+    <w:p>
+      <w:pPr>
+        <w:pStyle w:val="Lijstalinea"/>
+        <w:numPr>
+          <w:ilvl w:val="0"/>
+          <w:numId w:val="1"/>
+        </w:numPr>
+        <w:rPr>
+          <w:sz w:val="24"/>
+          <w:szCs w:val="24"/>
+        </w:rPr>
+      </w:pPr>
+      <w:r>
+        <w:rPr>
+          <w:sz w:val="24"/>
+          <w:szCs w:val="24"/>
+        </w:rPr>
+        <w:t>Trainability; since</w:t>
+      </w:r>
+      <w:r>
+        <w:rPr>
+          <w:sz w:val="24"/>
+          <w:szCs w:val="24"/>
+        </w:rPr>
+        <w:t xml:space="preserve"> the model has to detect</w:t>
+      </w:r>
+    </w:p>
+    <w:p>
+      <w:pPr>
+        <w:pStyle w:val="Lijstalinea"/>
+        <w:numPr>
+          <w:ilvl w:val="1"/>
+          <w:numId w:val="1"/>
+        </w:numPr>
+        <w:rPr>
+          <w:sz w:val="24"/>
+          <w:szCs w:val="24"/>
+        </w:rPr>
+      </w:pPr>
+      <w:r>
+        <w:rPr>
+          <w:sz w:val="24"/>
+          <w:szCs w:val="24"/>
+        </w:rPr>
+        <w:t>Signs (Stop,</w:t>
+      </w:r>
+      <w:r>
+        <w:rPr>
+          <w:sz w:val="24"/>
+          <w:szCs w:val="24"/>
+        </w:rPr>
+        <w:t xml:space="preserve"> Speed</w:t>
+      </w:r>
+      <w:r>
+        <w:rPr>
+          <w:sz w:val="24"/>
+          <w:szCs w:val="24"/>
+        </w:rPr>
+        <w:t xml:space="preserve">, </w:t>
+      </w:r>
+      <w:r>
+        <w:rPr>
+          <w:sz w:val="24"/>
+          <w:szCs w:val="24"/>
+        </w:rPr>
+        <w:t>Prohibited</w:t>
+      </w:r>
+      <w:r>
+        <w:rPr>
+          <w:sz w:val="24"/>
+          <w:szCs w:val="24"/>
+        </w:rPr>
+        <w:t xml:space="preserve">, </w:t>
+      </w:r>
+      <w:r>
+        <w:rPr>
+          <w:sz w:val="24"/>
+          <w:szCs w:val="24"/>
+        </w:rPr>
+        <w:t>Dir</w:t>
+      </w:r>
+      <w:r>
+        <w:rPr>
+          <w:sz w:val="24"/>
+          <w:szCs w:val="24"/>
+        </w:rPr>
+        <w:t>ectional</w:t>
+      </w:r>
+      <w:r>
+        <w:rPr>
+          <w:sz w:val="24"/>
+          <w:szCs w:val="24"/>
+        </w:rPr>
+        <w:t xml:space="preserve"> (one-way)</w:t>
+      </w:r>
+      <w:r>
+        <w:rPr>
+          <w:sz w:val="24"/>
+          <w:szCs w:val="24"/>
+        </w:rPr>
+        <w:t>, Mandatory</w:t>
+      </w:r>
+      <w:r>
+        <w:rPr>
+          <w:sz w:val="24"/>
+          <w:szCs w:val="24"/>
+        </w:rPr>
+        <w:t>)</w:t>
+      </w:r>
+      <w:r>
+        <w:rPr>
+          <w:sz w:val="24"/>
+          <w:szCs w:val="24"/>
+        </w:rPr>
+        <w:t>,</w:t>
+      </w:r>
+    </w:p>
+    <w:p>
+      <w:pPr>
+        <w:pStyle w:val="Lijstalinea"/>
+        <w:numPr>
+          <w:ilvl w:val="1"/>
+          <w:numId w:val="1"/>
+        </w:numPr>
+        <w:rPr>
+          <w:sz w:val="24"/>
+          <w:szCs w:val="24"/>
+        </w:rPr>
+      </w:pPr>
+      <w:r>
+        <w:rPr>
+          <w:sz w:val="24"/>
+          <w:szCs w:val="24"/>
+        </w:rPr>
+        <w:t>Pedestrians</w:t>
+      </w:r>
+      <w:r>
+        <w:rPr>
+          <w:sz w:val="24"/>
+          <w:szCs w:val="24"/>
+        </w:rPr>
+        <w:t>,</w:t>
+      </w:r>
+    </w:p>
+    <w:p>
+      <w:pPr>
+        <w:pStyle w:val="Lijstalinea"/>
+        <w:numPr>
+          <w:ilvl w:val="1"/>
+          <w:numId w:val="1"/>
+        </w:numPr>
+        <w:rPr>
+          <w:sz w:val="24"/>
+          <w:szCs w:val="24"/>
+        </w:rPr>
+      </w:pPr>
+      <w:r>
+        <w:rPr>
+          <w:sz w:val="24"/>
+          <w:szCs w:val="24"/>
+        </w:rPr>
+        <w:t>Vehicles (Cars)</w:t>
+      </w:r>
+      <w:r>
+        <w:rPr>
+          <w:sz w:val="24"/>
+          <w:szCs w:val="24"/>
+        </w:rPr>
+        <w:t>,</w:t>
+      </w:r>
+    </w:p>
+    <w:p>
+      <w:pPr>
+        <w:pStyle w:val="Lijstalinea"/>
+        <w:numPr>
+          <w:ilvl w:val="1"/>
+          <w:numId w:val="1"/>
+        </w:numPr>
+        <w:rPr>
+          <w:sz w:val="24"/>
+          <w:szCs w:val="24"/>
+        </w:rPr>
+      </w:pPr>
+      <w:r>
+        <w:rPr>
+          <w:sz w:val="24"/>
+          <w:szCs w:val="24"/>
+        </w:rPr>
+        <w:t>Traf</w:t>
+      </w:r>
+      <w:r>
+        <w:rPr>
+          <w:sz w:val="24"/>
+          <w:szCs w:val="24"/>
+        </w:rPr>
+        <w:t>f</w:t>
+      </w:r>
+      <w:r>
+        <w:rPr>
+          <w:sz w:val="24"/>
+          <w:szCs w:val="24"/>
+        </w:rPr>
+        <w:t>ic Lights</w:t>
+      </w:r>
+      <w:r>
+        <w:rPr>
+          <w:sz w:val="24"/>
+          <w:szCs w:val="24"/>
+        </w:rPr>
+        <w:t>.</w:t>
+      </w:r>
+    </w:p>
+    <w:p>
+      <w:pPr>
+        <w:pStyle w:val="Lijstalinea"/>
+        <w:ind w:left="405"/>
+        <w:rPr>
+          <w:sz w:val="24"/>
+          <w:szCs w:val="24"/>
+        </w:rPr>
+      </w:pPr>
+      <w:r>
+        <w:rPr>
+          <w:sz w:val="24"/>
+          <w:szCs w:val="24"/>
+        </w:rPr>
+        <w:t xml:space="preserve">The model has to at least be able to detect these </w:t>
+      </w:r>
+      <w:r>
+        <w:rPr>
+          <w:sz w:val="24"/>
+          <w:szCs w:val="24"/>
+        </w:rPr>
+        <w:t>object types and their subcategories</w:t>
+      </w:r>
+      <w:r>
+        <w:rPr>
+          <w:sz w:val="24"/>
+          <w:szCs w:val="24"/>
+        </w:rPr>
+        <w:t>. Because of that is important for the model to be trainable</w:t>
+      </w:r>
+      <w:r>
+        <w:rPr>
+          <w:sz w:val="24"/>
+          <w:szCs w:val="24"/>
+        </w:rPr>
+        <w:t>.</w:t>
+      </w:r>
+    </w:p>
+    <w:p>
+      <w:pPr>
+        <w:rPr>
+          <w:sz w:val="24"/>
+          <w:szCs w:val="24"/>
+        </w:rPr>
+      </w:pPr>
+    </w:p>
+    <w:p>
+      <w:pPr>
+        <w:pStyle w:val="Kop2"/>
+      </w:pPr>
+      <w:bookmarkStart w:id="4" w:name="_Toc222405886"/>
+      <w:r>
+        <w:t>Results</w:t>
+      </w:r>
+      <w:bookmarkEnd w:id="4"/>
+    </w:p>
+    <w:tbl>
+      <w:tblPr>
+        <w:tblStyle w:val="Tabelraster"/>
+        <w:tblW w:w="0" w:type="auto"/>
+        <w:tblLook w:val="04A0" w:firstRow="1" w:lastRow="0" w:firstColumn="1" w:lastColumn="0" w:noHBand="0" w:noVBand="1"/>
+      </w:tblPr>
+      <w:tblGrid>
+        <w:gridCol w:w="1812"/>
+        <w:gridCol w:w="1812"/>
+        <w:gridCol w:w="1812"/>
+        <w:gridCol w:w="1813"/>
+        <w:gridCol w:w="1813"/>
+      </w:tblGrid>
+      <w:tr>
+        <w:tc>
+          <w:tcPr>
+            <w:tcW w:w="1812" w:type="dxa"/>
+          </w:tcPr>
+          <w:p>
+            <w:pPr>
+              <w:rPr>
+                <w:sz w:val="24"/>
+                <w:szCs w:val="24"/>
+              </w:rPr>
+            </w:pPr>
+          </w:p>
+        </w:tc>
+        <w:tc>
+          <w:tcPr>
+            <w:tcW w:w="1812" w:type="dxa"/>
+          </w:tcPr>
+          <w:p>
+            <w:pPr>
+              <w:rPr>
+                <w:sz w:val="24"/>
+                <w:szCs w:val="24"/>
+              </w:rPr>
+            </w:pPr>
+            <w:r>
+              <w:rPr>
+                <w:sz w:val="24"/>
+                <w:szCs w:val="24"/>
+              </w:rPr>
+              <w:t>YOLO</w:t>
+            </w:r>
+            <w:r>
+              <w:rPr>
+                <w:sz w:val="24"/>
+                <w:szCs w:val="24"/>
+              </w:rPr>
+              <w:t>v8</w:t>
+            </w:r>
+          </w:p>
+        </w:tc>
+        <w:tc>
+          <w:tcPr>
+            <w:tcW w:w="1812" w:type="dxa"/>
+          </w:tcPr>
+          <w:p>
+            <w:pPr>
+              <w:rPr>
+                <w:sz w:val="24"/>
+                <w:szCs w:val="24"/>
+              </w:rPr>
+            </w:pPr>
+            <w:r>
+              <w:rPr>
+                <w:sz w:val="24"/>
+                <w:szCs w:val="24"/>
+              </w:rPr>
+              <w:t>YOLOv26</w:t>
+            </w:r>
+          </w:p>
+        </w:tc>
+        <w:tc>
+          <w:tcPr>
+            <w:tcW w:w="1813" w:type="dxa"/>
+          </w:tcPr>
+          <w:p>
+            <w:pPr>
+              <w:rPr>
+                <w:sz w:val="24"/>
+                <w:szCs w:val="24"/>
+              </w:rPr>
+            </w:pPr>
+            <w:r>
+              <w:rPr>
+                <w:sz w:val="24"/>
+                <w:szCs w:val="24"/>
+              </w:rPr>
+              <w:t>SSD</w:t>
+            </w:r>
+          </w:p>
+        </w:tc>
+        <w:tc>
+          <w:tcPr>
+            <w:tcW w:w="1813" w:type="dxa"/>
+          </w:tcPr>
+          <w:p>
+            <w:pPr>
+              <w:rPr>
+                <w:sz w:val="24"/>
+                <w:szCs w:val="24"/>
+              </w:rPr>
+            </w:pPr>
+            <w:r>
+              <w:rPr>
+                <w:sz w:val="24"/>
+                <w:szCs w:val="24"/>
+              </w:rPr>
+              <w:t>Faster R-CNN</w:t>
+            </w:r>
+          </w:p>
+        </w:tc>
+      </w:tr>
+      <w:tr>
+        <w:tc>
+          <w:tcPr>
+            <w:tcW w:w="1812" w:type="dxa"/>
+          </w:tcPr>
+          <w:p>
+            <w:pPr>
+              <w:rPr>
+                <w:sz w:val="24"/>
+                <w:szCs w:val="24"/>
+              </w:rPr>
+            </w:pPr>
+            <w:r>
+              <w:rPr>
+                <w:sz w:val="24"/>
+                <w:szCs w:val="24"/>
+              </w:rPr>
+              <w:t>Latency</w:t>
+            </w:r>
+          </w:p>
+        </w:tc>
+        <w:tc>
+          <w:tcPr>
+            <w:tcW w:w="1812" w:type="dxa"/>
+          </w:tcPr>
+          <w:p>
+            <w:pPr>
+              <w:rPr>
+                <w:sz w:val="24"/>
+                <w:szCs w:val="24"/>
+              </w:rPr>
+            </w:pPr>
+          </w:p>
+        </w:tc>
+        <w:tc>
+          <w:tcPr>
+            <w:tcW w:w="1812" w:type="dxa"/>
+          </w:tcPr>
+          <w:p>
+            <w:pPr>
+              <w:rPr>
+                <w:sz w:val="24"/>
+                <w:szCs w:val="24"/>
+              </w:rPr>
+            </w:pPr>
+          </w:p>
+        </w:tc>
+        <w:tc>
+          <w:tcPr>
+            <w:tcW w:w="1813" w:type="dxa"/>
+          </w:tcPr>
+          <w:p>
+            <w:pPr>
+              <w:rPr>
+                <w:sz w:val="24"/>
+                <w:szCs w:val="24"/>
+              </w:rPr>
+            </w:pPr>
+          </w:p>
+        </w:tc>
+        <w:tc>
+          <w:tcPr>
+            <w:tcW w:w="1813" w:type="dxa"/>
+          </w:tcPr>
+          <w:p>
+            <w:pPr>
+              <w:rPr>
+                <w:sz w:val="24"/>
+                <w:szCs w:val="24"/>
+              </w:rPr>
+            </w:pPr>
+          </w:p>
+        </w:tc>
+      </w:tr>
+      <w:tr>
+        <w:tc>
+          <w:tcPr>
+            <w:tcW w:w="1812" w:type="dxa"/>
+          </w:tcPr>
+          <w:p>
+            <w:pPr>
+              <w:rPr>
+                <w:sz w:val="24"/>
+                <w:szCs w:val="24"/>
+              </w:rPr>
+            </w:pPr>
+            <w:r>
+              <w:rPr>
+                <w:sz w:val="24"/>
+                <w:szCs w:val="24"/>
+              </w:rPr>
+              <w:t>Accuracy</w:t>
+            </w:r>
+          </w:p>
+        </w:tc>
+        <w:tc>
+          <w:tcPr>
+            <w:tcW w:w="1812" w:type="dxa"/>
+          </w:tcPr>
+          <w:p>
+            <w:pPr>
+              <w:rPr>
+                <w:sz w:val="24"/>
+                <w:szCs w:val="24"/>
+              </w:rPr>
+            </w:pPr>
+          </w:p>
+        </w:tc>
+        <w:tc>
+          <w:tcPr>
+            <w:tcW w:w="1812" w:type="dxa"/>
+          </w:tcPr>
+          <w:p>
+            <w:pPr>
+              <w:rPr>
+                <w:sz w:val="24"/>
+                <w:szCs w:val="24"/>
+              </w:rPr>
+            </w:pPr>
+          </w:p>
+        </w:tc>
+        <w:tc>
+          <w:tcPr>
+            <w:tcW w:w="1813" w:type="dxa"/>
+          </w:tcPr>
+          <w:p>
+            <w:pPr>
+              <w:rPr>
+                <w:sz w:val="24"/>
+                <w:szCs w:val="24"/>
+              </w:rPr>
+            </w:pPr>
+          </w:p>
+        </w:tc>
+        <w:tc>
+          <w:tcPr>
+            <w:tcW w:w="1813" w:type="dxa"/>
+          </w:tcPr>
+          <w:p>
+            <w:pPr>
+              <w:rPr>
+                <w:sz w:val="24"/>
+                <w:szCs w:val="24"/>
+              </w:rPr>
+            </w:pPr>
+          </w:p>
+        </w:tc>
+      </w:tr>
+      <w:tr>
+        <w:tc>
+          <w:tcPr>
+            <w:tcW w:w="1812" w:type="dxa"/>
+          </w:tcPr>
+          <w:p>
+            <w:pPr>
+              <w:rPr>
+                <w:sz w:val="24"/>
+                <w:szCs w:val="24"/>
+              </w:rPr>
+            </w:pPr>
+            <w:r>
+              <w:rPr>
+                <w:sz w:val="24"/>
+                <w:szCs w:val="24"/>
+              </w:rPr>
+              <w:t>Load</w:t>
+            </w:r>
+          </w:p>
+        </w:tc>
+        <w:tc>
+          <w:tcPr>
+            <w:tcW w:w="1812" w:type="dxa"/>
+          </w:tcPr>
+          <w:p>
+            <w:pPr>
+              <w:rPr>
+                <w:sz w:val="24"/>
+                <w:szCs w:val="24"/>
+              </w:rPr>
+            </w:pPr>
+          </w:p>
+        </w:tc>
+        <w:tc>
+          <w:tcPr>
+            <w:tcW w:w="1812" w:type="dxa"/>
+          </w:tcPr>
+          <w:p>
+            <w:pPr>
+              <w:rPr>
+                <w:sz w:val="24"/>
+                <w:szCs w:val="24"/>
+              </w:rPr>
+            </w:pPr>
+          </w:p>
+        </w:tc>
+        <w:tc>
+          <w:tcPr>
+            <w:tcW w:w="1813" w:type="dxa"/>
+          </w:tcPr>
+          <w:p>
+            <w:pPr>
+              <w:rPr>
+                <w:sz w:val="24"/>
+                <w:szCs w:val="24"/>
+              </w:rPr>
+            </w:pPr>
+          </w:p>
+        </w:tc>
+        <w:tc>
+          <w:tcPr>
+            <w:tcW w:w="1813" w:type="dxa"/>
+          </w:tcPr>
+          <w:p>
+            <w:pPr>
+              <w:rPr>
+                <w:sz w:val="24"/>
+                <w:szCs w:val="24"/>
+              </w:rPr>
+            </w:pPr>
+          </w:p>
+        </w:tc>
+      </w:tr>
+      <w:tr>
+        <w:tc>
+          <w:tcPr>
+            <w:tcW w:w="1812" w:type="dxa"/>
+          </w:tcPr>
+          <w:p>
+            <w:pPr>
+              <w:rPr>
+                <w:sz w:val="24"/>
+                <w:szCs w:val="24"/>
+              </w:rPr>
+            </w:pPr>
+            <w:r>
+              <w:rPr>
+                <w:sz w:val="24"/>
+                <w:szCs w:val="24"/>
+              </w:rPr>
+              <w:t>Trainability</w:t>
+            </w:r>
+          </w:p>
+        </w:tc>
+        <w:tc>
+          <w:tcPr>
+            <w:tcW w:w="1812" w:type="dxa"/>
+          </w:tcPr>
+          <w:p>
+            <w:pPr>
+              <w:rPr>
+                <w:sz w:val="24"/>
+                <w:szCs w:val="24"/>
+              </w:rPr>
+            </w:pPr>
+          </w:p>
+        </w:tc>
+        <w:tc>
+          <w:tcPr>
+            <w:tcW w:w="1812" w:type="dxa"/>
+          </w:tcPr>
+          <w:p>
+            <w:pPr>
+              <w:rPr>
+                <w:sz w:val="24"/>
+                <w:szCs w:val="24"/>
+              </w:rPr>
+            </w:pPr>
+          </w:p>
+        </w:tc>
+        <w:tc>
+          <w:tcPr>
+            <w:tcW w:w="1813" w:type="dxa"/>
+          </w:tcPr>
+          <w:p>
+            <w:pPr>
+              <w:rPr>
+                <w:sz w:val="24"/>
+                <w:szCs w:val="24"/>
+              </w:rPr>
+            </w:pPr>
+          </w:p>
+        </w:tc>
+        <w:tc>
+          <w:tcPr>
+            <w:tcW w:w="1813" w:type="dxa"/>
+          </w:tcPr>
+          <w:p>
+            <w:pPr>
+              <w:rPr>
+                <w:sz w:val="24"/>
+                <w:szCs w:val="24"/>
+              </w:rPr>
+            </w:pPr>
+          </w:p>
+        </w:tc>
+      </w:tr>
+    </w:tbl>
+    <w:p>
+      <w:pPr>
+        <w:rPr>
+          <w:sz w:val="24"/>
+          <w:szCs w:val="24"/>
+        </w:rPr>
+      </w:pPr>
+    </w:p>
+    <w:p>
+      <w:pPr>
+        <w:rPr>
+          <w:sz w:val="24"/>
+          <w:szCs w:val="24"/>
+        </w:rPr>
+      </w:pPr>
+    </w:p>
+    <w:p>
+      <w:pPr>
+        <w:pStyle w:val="Kop2"/>
+      </w:pPr>
+      <w:bookmarkStart w:id="5" w:name="_Toc222405887"/>
+      <w:r>
+        <w:t>Conclusi</w:t>
+      </w:r>
+      <w:r>
+        <w:t>on</w:t>
+      </w:r>
+      <w:bookmarkEnd w:id="5"/>
+    </w:p>
+    <w:p>
+      <w:pPr>
+        <w:rPr>
+          <w:sz w:val="24"/>
+          <w:szCs w:val="24"/>
+        </w:rPr>
+      </w:pPr>
+    </w:p>
+    <w:p>
+      <w:pPr>
+        <w:rPr>
+          <w:sz w:val="24"/>
+          <w:szCs w:val="24"/>
+        </w:rPr>
+      </w:pPr>
+    </w:p>
+    <w:p>
+      <w:pPr>
+        <w:pStyle w:val="Kop2"/>
+      </w:pPr>
+      <w:bookmarkStart w:id="6" w:name="_Toc222405888"/>
+      <w:r>
+        <w:t>Sources</w:t>
+      </w:r>
+      <w:bookmarkEnd w:id="6"/>
+    </w:p>
+    <w:p>
+      <w:pPr>
+        <w:rPr>
+          <w:sz w:val="24"/>
+          <w:szCs w:val="24"/>
+        </w:rPr>
+      </w:pPr>
+      <w:r>
+        <w:rPr>
+          <w:sz w:val="24"/>
+          <w:szCs w:val="24"/>
+        </w:rPr>
+        <w:t>[1]</w:t>
+      </w:r>
+      <w:r>
+        <w:rPr>
+          <w:sz w:val="24"/>
+          <w:szCs w:val="24"/>
+        </w:rPr>
+        <w:tab/>
+      </w:r>
+      <w:hyperlink r:id="rId6" w:history="1">
+        <w:r>
+          <w:rPr>
+            <w:rStyle w:val="Hyperlink"/>
+            <w:sz w:val="24"/>
+            <w:szCs w:val="24"/>
+          </w:rPr>
+          <w:t>https://encord.com/blog/object-detection/</w:t>
+        </w:r>
+      </w:hyperlink>
+      <w:r>
+        <w:rPr>
+          <w:sz w:val="24"/>
+          <w:szCs w:val="24"/>
+        </w:rPr>
+        <w:t xml:space="preserve"> (MODELS)</w:t>
+      </w:r>
+    </w:p>
+    <w:p>
+      <w:pPr>
+        <w:rPr>
+          <w:sz w:val="24"/>
+          <w:szCs w:val="24"/>
+        </w:rPr>
+      </w:pPr>
+      <w:r>
+        <w:rPr>
+          <w:sz w:val="24"/>
+          <w:szCs w:val="24"/>
+        </w:rPr>
+        <w:t>[</w:t>
+      </w:r>
+      <w:r>
+        <w:rPr>
+          <w:sz w:val="24"/>
+          <w:szCs w:val="24"/>
+        </w:rPr>
+        <w:t>2</w:t>
+      </w:r>
+      <w:r>
+        <w:rPr>
+          <w:sz w:val="24"/>
+          <w:szCs w:val="24"/>
+        </w:rPr>
+        <w:t>]</w:t>
+      </w:r>
+      <w:r>
+        <w:rPr>
+          <w:sz w:val="24"/>
+          <w:szCs w:val="24"/>
+        </w:rPr>
+        <w:t xml:space="preserve"> </w:t>
+      </w:r>
+      <w:r>
+        <w:rPr>
+          <w:sz w:val="24"/>
+          <w:szCs w:val="24"/>
+        </w:rPr>
+        <w:tab/>
+      </w:r>
+      <w:hyperlink r:id="rId7" w:anchor="models" w:history="1">
+        <w:r>
+          <w:rPr>
+            <w:rStyle w:val="Hyperlink"/>
+            <w:sz w:val="24"/>
+            <w:szCs w:val="24"/>
+          </w:rPr>
+          <w:t>https://docs.ultralytics.com/tasks/detect/#models</w:t>
+        </w:r>
+      </w:hyperlink>
+      <w:r>
+        <w:rPr>
+          <w:sz w:val="24"/>
+          <w:szCs w:val="24"/>
+        </w:rPr>
+        <w:t xml:space="preserve"> (YOLO)</w:t>
+      </w:r>
+    </w:p>
+    <w:p>
+      <w:pPr>
+        <w:rPr>
+          <w:sz w:val="24"/>
+          <w:szCs w:val="24"/>
+        </w:rPr>
+      </w:pPr>
+      <w:r>
+        <w:rPr>
+          <w:sz w:val="24"/>
+          <w:szCs w:val="24"/>
+        </w:rPr>
+        <w:t>[3]</w:t>
+      </w:r>
+      <w:r>
+        <w:rPr>
+          <w:sz w:val="24"/>
+          <w:szCs w:val="24"/>
+        </w:rPr>
+        <w:tab/>
+      </w:r>
+      <w:hyperlink r:id="rId8" w:history="1">
+        <w:r>
+          <w:rPr>
+            <w:rStyle w:val="Hyperlink"/>
+            <w:sz w:val="24"/>
+            <w:szCs w:val="24"/>
+          </w:rPr>
+          <w:t>https://developers.arcgis.com/python/latest/guide/how-ssd-works/</w:t>
+        </w:r>
+      </w:hyperlink>
+      <w:r>
+        <w:rPr>
+          <w:sz w:val="24"/>
+          <w:szCs w:val="24"/>
+        </w:rPr>
+        <w:t xml:space="preserve"> (SSD)</w:t>
+      </w:r>
+    </w:p>
+    <w:p>
+      <w:pPr>
+        <w:rPr>
+          <w:sz w:val="24"/>
+          <w:szCs w:val="24"/>
+        </w:rPr>
+      </w:pPr>
+      <w:r>
+        <w:rPr>
+          <w:sz w:val="24"/>
+          <w:szCs w:val="24"/>
+        </w:rPr>
+        <w:t xml:space="preserve">[4] </w:t>
+      </w:r>
+      <w:r>
+        <w:rPr>
+          <w:sz w:val="24"/>
+          <w:szCs w:val="24"/>
+        </w:rPr>
+        <w:tab/>
+      </w:r>
+      <w:hyperlink r:id="rId9" w:history="1">
+        <w:r>
+          <w:rPr>
+            <w:rStyle w:val="Hyperlink"/>
+            <w:sz w:val="24"/>
+            <w:szCs w:val="24"/>
+          </w:rPr>
+          <w:t>https://www.ultralytics.com/blog/what-is-r-cnn-a-quick-overview</w:t>
+        </w:r>
+      </w:hyperlink>
+      <w:r>
+        <w:rPr>
+          <w:sz w:val="24"/>
+          <w:szCs w:val="24"/>
+        </w:rPr>
+        <w:t xml:space="preserve"> (R-CNN)</w:t>
+      </w:r>
+    </w:p>
+    <w:p>
+      <w:pPr>
+        <w:rPr>
+          <w:sz w:val="24"/>
+          <w:szCs w:val="24"/>
+        </w:rPr>
+      </w:pPr>
+      <w:r>
+        <w:rPr>
+          <w:sz w:val="24"/>
+          <w:szCs w:val="24"/>
+        </w:rPr>
+        <w:t>[5]</w:t>
+      </w:r>
+      <w:r>
+        <w:rPr>
+          <w:sz w:val="24"/>
+          <w:szCs w:val="24"/>
+        </w:rPr>
+        <w:tab/>
+      </w:r>
+      <w:hyperlink r:id="rId10" w:history="1">
+        <w:r>
+          <w:rPr>
+            <w:rStyle w:val="Hyperlink"/>
+            <w:sz w:val="24"/>
+            <w:szCs w:val="24"/>
+          </w:rPr>
+          <w:t>https://github.com/mohamed-said-ibrahem/PV-RCNN_Point-Voxel-Feature-Set-Abstraction-For-3D-Object-Detection</w:t>
+        </w:r>
+      </w:hyperlink>
+      <w:r>
+        <w:rPr>
+          <w:sz w:val="24"/>
+          <w:szCs w:val="24"/>
+        </w:rPr>
+        <w:t xml:space="preserve"> (PV-RCNN</w:t>
+      </w:r>
+      <w:r>
+        <w:rPr>
+          <w:sz w:val="24"/>
+          <w:szCs w:val="24"/>
+        </w:rPr>
+        <w:t>)</w:t>
+      </w:r>
+    </w:p>
+    <w:p>
+      <w:pPr>
+        <w:rPr>
+          <w:sz w:val="24"/>
+          <w:szCs w:val="24"/>
+        </w:rPr>
+      </w:pPr>
+    </w:p>
+    <w:p>
+      <w:pPr>
+        <w:pStyle w:val="Kop2"/>
+      </w:pPr>
+      <w:bookmarkStart w:id="7" w:name="_Toc222405889"/>
+      <w:r>
+        <w:t>Changelog</w:t>
+      </w:r>
+      <w:bookmarkEnd w:id="7"/>
+    </w:p>
+    <w:tbl>
+      <w:tblPr>
+        <w:tblStyle w:val="Tabelraster"/>
+        <w:tblW w:w="0" w:type="auto"/>
+        <w:tblLook w:val="04A0" w:firstRow="1" w:lastRow="0" w:firstColumn="1" w:lastColumn="0" w:noHBand="0" w:noVBand="1"/>
+      </w:tblPr>
+      <w:tblGrid>
+        <w:gridCol w:w="925"/>
+        <w:gridCol w:w="6874"/>
+        <w:gridCol w:w="1263"/>
+      </w:tblGrid>
+      <w:tr>
+        <w:tc>
+          <w:tcPr>
+            <w:tcW w:w="846" w:type="dxa"/>
+          </w:tcPr>
+          <w:p>
+            <w:pPr>
+              <w:jc w:val="center"/>
+            </w:pPr>
+            <w:r>
+              <w:t>Versi</w:t>
+            </w:r>
+            <w:r>
+              <w:t>on</w:t>
+            </w:r>
+          </w:p>
+        </w:tc>
+        <w:tc>
+          <w:tcPr>
+            <w:tcW w:w="6946" w:type="dxa"/>
+          </w:tcPr>
+          <w:p>
+            <w:r>
+              <w:t>Changes</w:t>
+            </w:r>
+          </w:p>
+        </w:tc>
+        <w:tc>
+          <w:tcPr>
+            <w:tcW w:w="1270" w:type="dxa"/>
+          </w:tcPr>
+          <w:p>
+            <w:pPr>
+              <w:jc w:val="center"/>
+            </w:pPr>
+            <w:r>
+              <w:t>Dat</w:t>
+            </w:r>
+            <w:r>
+              <w:t>e</w:t>
+            </w:r>
+          </w:p>
+        </w:tc>
+      </w:tr>
+      <w:tr>
+        <w:tc>
+          <w:tcPr>
+            <w:tcW w:w="846" w:type="dxa"/>
+          </w:tcPr>
+          <w:p>
+            <w:pPr>
+              <w:jc w:val="center"/>
+            </w:pPr>
+            <w:r>
+              <w:t>0.1</w:t>
+            </w:r>
+          </w:p>
+        </w:tc>
+        <w:tc>
+          <w:tcPr>
+            <w:tcW w:w="6946" w:type="dxa"/>
+          </w:tcPr>
+          <w:p>
+            <w:r>
+              <w:t>Document Made</w:t>
+            </w:r>
+          </w:p>
+        </w:tc>
+        <w:tc>
+          <w:tcPr>
+            <w:tcW w:w="1270" w:type="dxa"/>
+          </w:tcPr>
+          <w:p>
+            <w:pPr>
+              <w:jc w:val="center"/>
+            </w:pPr>
+            <w:r>
+              <w:t>19-2-2026</w:t>
+            </w:r>
+          </w:p>
+        </w:tc>
+      </w:tr>
+      <w:tr>
+        <w:tc>
+          <w:tcPr>
+            <w:tcW w:w="846" w:type="dxa"/>
+          </w:tcPr>
+          <w:p>
+            <w:pPr>
+              <w:jc w:val="center"/>
+            </w:pPr>
+            <w:r>
+              <w:t>1.0</w:t>
+            </w:r>
+          </w:p>
+        </w:tc>
+        <w:tc>
+          <w:tcPr>
+            <w:tcW w:w="6946" w:type="dxa"/>
+          </w:tcPr>
+          <w:p/>
+        </w:tc>
+        <w:tc>
+          <w:tcPr>
+            <w:tcW w:w="1270" w:type="dxa"/>
+          </w:tcPr>
+          <w:p>
+            <w:pPr>
+              <w:jc w:val="center"/>
+            </w:pPr>
+          </w:p>
+        </w:tc>
+      </w:tr>
+      <w:tr>
+        <w:tc>
+          <w:tcPr>
+            <w:tcW w:w="846" w:type="dxa"/>
+          </w:tcPr>
+          <w:p>
+            <w:pPr>
+              <w:jc w:val="center"/>
+            </w:pPr>
+          </w:p>
+        </w:tc>
+        <w:tc>
+          <w:tcPr>
+            <w:tcW w:w="6946" w:type="dxa"/>
+          </w:tcPr>
+          <w:p/>
+        </w:tc>
+        <w:tc>
+          <w:tcPr>
+            <w:tcW w:w="1270" w:type="dxa"/>
+          </w:tcPr>
+          <w:p>
+            <w:pPr>
+              <w:jc w:val="center"/>
+            </w:pPr>
+          </w:p>
+        </w:tc>
+      </w:tr>
+    </w:tbl>
     <w:p/>
     <w:sectPr>
       <w:pgSz w:w="11906" w:h="16838"/>
@@ -762,6 +3235,242 @@
     </w:sectPr>
   </w:body>
 </w:document>
+</file>
+
+<file path=word/numbering.xml><?xml version="1.0" encoding="utf-8"?>
+<w:numbering xmlns:wpc="http://schemas.microsoft.com/office/word/2010/wordprocessingCanvas" xmlns:cx="http://schemas.microsoft.com/office/drawing/2014/chartex" xmlns:cx1="http://schemas.microsoft.com/office/drawing/2015/9/8/chartex" xmlns:cx2="http://schemas.microsoft.com/office/drawing/2015/10/21/chartex" xmlns:cx3="http://schemas.microsoft.com/office/drawing/2016/5/9/chartex" xmlns:cx4="http://schemas.microsoft.com/office/drawing/2016/5/10/chartex" xmlns:cx5="http://schemas.microsoft.com/office/drawing/2016/5/11/chartex" xmlns:cx6="http://schemas.microsoft.com/office/drawing/2016/5/12/chartex" xmlns:cx7="http://schemas.microsoft.com/office/drawing/2016/5/13/chartex" xmlns:cx8="http://schemas.microsoft.com/office/drawing/2016/5/14/chartex" xmlns:mc="http://schemas.openxmlformats.org/markup-compatibility/2006" xmlns:aink="http://schemas.microsoft.com/office/drawing/2016/ink" xmlns:am3d="http://schemas.microsoft.com/office/drawing/2017/model3d" xmlns:o="urn:schemas-microsoft-com:office:office" xmlns:oel="http://schemas.microsoft.com/office/2019/extlst" xmlns:r="http://schemas.openxmlformats.org/officeDocument/2006/relationships" xmlns:m="http://schemas.openxmlformats.org/officeDocument/2006/math" xmlns:v="urn:schemas-microsoft-com:vml" xmlns:wp14="http://schemas.microsoft.com/office/word/2010/wordprocessingDrawing" xmlns:wp="http://schemas.openxmlformats.org/drawingml/2006/wordprocessingDrawing" xmlns:w10="urn:schemas-microsoft-com:office:word" xmlns:w="http://schemas.openxmlformats.org/wordprocessingml/2006/main" xmlns:w14="http://schemas.microsoft.com/office/word/2010/wordml" xmlns:w15="http://schemas.microsoft.com/office/word/2012/wordml" xmlns:w16cex="http://schemas.microsoft.com/office/word/2018/wordml/cex" xmlns:w16cid="http://schemas.microsoft.com/office/word/2016/wordml/cid" xmlns:w16="http://schemas.microsoft.com/office/word/2018/wordml" xmlns:w16du="http://schemas.microsoft.com/office/word/2023/wordml/word16du" xmlns:w16sdtdh="http://schemas.microsoft.com/office/word/2020/wordml/sdtdatahash" xmlns:w16sdtfl="http://schemas.microsoft.com/office/word/2024/wordml/sdtformatlock" xmlns:w16se="http://schemas.microsoft.com/office/word/2015/wordml/symex" xmlns:wpg="http://schemas.microsoft.com/office/word/2010/wordprocessingGroup" xmlns:wpi="http://schemas.microsoft.com/office/word/2010/wordprocessingInk" xmlns:wne="http://schemas.microsoft.com/office/word/2006/wordml" xmlns:wps="http://schemas.microsoft.com/office/word/2010/wordprocessingShape" mc:Ignorable="w14 w15 w16se w16cid w16 w16cex w16sdtdh w16sdtfl w16du wp14">
+  <w:abstractNum w:abstractNumId="0" w15:restartNumberingAfterBreak="0">
+    <w:nsid w:val="18E71895"/>
+    <w:multiLevelType w:val="hybridMultilevel"/>
+    <w:tmpl w:val="E8908C02"/>
+    <w:lvl w:ilvl="0" w:tplc="1D9414D8">
+      <w:numFmt w:val="bullet"/>
+      <w:lvlText w:val="-"/>
+      <w:lvlJc w:val="left"/>
+      <w:pPr>
+        <w:ind w:left="405" w:hanging="360"/>
+      </w:pPr>
+      <w:rPr>
+        <w:rFonts w:ascii="Aptos" w:eastAsiaTheme="minorHAnsi" w:hAnsi="Aptos" w:cstheme="minorBidi" w:hint="default"/>
+      </w:rPr>
+    </w:lvl>
+    <w:lvl w:ilvl="1" w:tplc="04130003">
+      <w:start w:val="1"/>
+      <w:numFmt w:val="bullet"/>
+      <w:lvlText w:val="o"/>
+      <w:lvlJc w:val="left"/>
+      <w:pPr>
+        <w:ind w:left="1125" w:hanging="360"/>
+      </w:pPr>
+      <w:rPr>
+        <w:rFonts w:ascii="Courier New" w:hAnsi="Courier New" w:cs="Courier New" w:hint="default"/>
+      </w:rPr>
+    </w:lvl>
+    <w:lvl w:ilvl="2" w:tplc="04130005" w:tentative="1">
+      <w:start w:val="1"/>
+      <w:numFmt w:val="bullet"/>
+      <w:lvlText w:val=""/>
+      <w:lvlJc w:val="left"/>
+      <w:pPr>
+        <w:ind w:left="1845" w:hanging="360"/>
+      </w:pPr>
+      <w:rPr>
+        <w:rFonts w:ascii="Wingdings" w:hAnsi="Wingdings" w:hint="default"/>
+      </w:rPr>
+    </w:lvl>
+    <w:lvl w:ilvl="3" w:tplc="04130001" w:tentative="1">
+      <w:start w:val="1"/>
+      <w:numFmt w:val="bullet"/>
+      <w:lvlText w:val=""/>
+      <w:lvlJc w:val="left"/>
+      <w:pPr>
+        <w:ind w:left="2565" w:hanging="360"/>
+      </w:pPr>
+      <w:rPr>
+        <w:rFonts w:ascii="Symbol" w:hAnsi="Symbol" w:hint="default"/>
+      </w:rPr>
+    </w:lvl>
+    <w:lvl w:ilvl="4" w:tplc="04130003" w:tentative="1">
+      <w:start w:val="1"/>
+      <w:numFmt w:val="bullet"/>
+      <w:lvlText w:val="o"/>
+      <w:lvlJc w:val="left"/>
+      <w:pPr>
+        <w:ind w:left="3285" w:hanging="360"/>
+      </w:pPr>
+      <w:rPr>
+        <w:rFonts w:ascii="Courier New" w:hAnsi="Courier New" w:cs="Courier New" w:hint="default"/>
+      </w:rPr>
+    </w:lvl>
+    <w:lvl w:ilvl="5" w:tplc="04130005" w:tentative="1">
+      <w:start w:val="1"/>
+      <w:numFmt w:val="bullet"/>
+      <w:lvlText w:val=""/>
+      <w:lvlJc w:val="left"/>
+      <w:pPr>
+        <w:ind w:left="4005" w:hanging="360"/>
+      </w:pPr>
+      <w:rPr>
+        <w:rFonts w:ascii="Wingdings" w:hAnsi="Wingdings" w:hint="default"/>
+      </w:rPr>
+    </w:lvl>
+    <w:lvl w:ilvl="6" w:tplc="04130001" w:tentative="1">
+      <w:start w:val="1"/>
+      <w:numFmt w:val="bullet"/>
+      <w:lvlText w:val=""/>
+      <w:lvlJc w:val="left"/>
+      <w:pPr>
+        <w:ind w:left="4725" w:hanging="360"/>
+      </w:pPr>
+      <w:rPr>
+        <w:rFonts w:ascii="Symbol" w:hAnsi="Symbol" w:hint="default"/>
+      </w:rPr>
+    </w:lvl>
+    <w:lvl w:ilvl="7" w:tplc="04130003" w:tentative="1">
+      <w:start w:val="1"/>
+      <w:numFmt w:val="bullet"/>
+      <w:lvlText w:val="o"/>
+      <w:lvlJc w:val="left"/>
+      <w:pPr>
+        <w:ind w:left="5445" w:hanging="360"/>
+      </w:pPr>
+      <w:rPr>
+        <w:rFonts w:ascii="Courier New" w:hAnsi="Courier New" w:cs="Courier New" w:hint="default"/>
+      </w:rPr>
+    </w:lvl>
+    <w:lvl w:ilvl="8" w:tplc="04130005" w:tentative="1">
+      <w:start w:val="1"/>
+      <w:numFmt w:val="bullet"/>
+      <w:lvlText w:val=""/>
+      <w:lvlJc w:val="left"/>
+      <w:pPr>
+        <w:ind w:left="6165" w:hanging="360"/>
+      </w:pPr>
+      <w:rPr>
+        <w:rFonts w:ascii="Wingdings" w:hAnsi="Wingdings" w:hint="default"/>
+      </w:rPr>
+    </w:lvl>
+  </w:abstractNum>
+  <w:abstractNum w:abstractNumId="1" w15:restartNumberingAfterBreak="0">
+    <w:nsid w:val="1B82107D"/>
+    <w:multiLevelType w:val="multilevel"/>
+    <w:tmpl w:val="60FC0F74"/>
+    <w:lvl w:ilvl="0">
+      <w:start w:val="1"/>
+      <w:numFmt w:val="decimal"/>
+      <w:lvlText w:val="%1."/>
+      <w:lvlJc w:val="left"/>
+      <w:pPr>
+        <w:tabs>
+          <w:tab w:val="num" w:pos="720"/>
+        </w:tabs>
+        <w:ind w:left="720" w:hanging="360"/>
+      </w:pPr>
+    </w:lvl>
+    <w:lvl w:ilvl="1" w:tentative="1">
+      <w:start w:val="1"/>
+      <w:numFmt w:val="decimal"/>
+      <w:lvlText w:val="%2."/>
+      <w:lvlJc w:val="left"/>
+      <w:pPr>
+        <w:tabs>
+          <w:tab w:val="num" w:pos="1440"/>
+        </w:tabs>
+        <w:ind w:left="1440" w:hanging="360"/>
+      </w:pPr>
+    </w:lvl>
+    <w:lvl w:ilvl="2" w:tentative="1">
+      <w:start w:val="1"/>
+      <w:numFmt w:val="decimal"/>
+      <w:lvlText w:val="%3."/>
+      <w:lvlJc w:val="left"/>
+      <w:pPr>
+        <w:tabs>
+          <w:tab w:val="num" w:pos="2160"/>
+        </w:tabs>
+        <w:ind w:left="2160" w:hanging="360"/>
+      </w:pPr>
+    </w:lvl>
+    <w:lvl w:ilvl="3" w:tentative="1">
+      <w:start w:val="1"/>
+      <w:numFmt w:val="decimal"/>
+      <w:lvlText w:val="%4."/>
+      <w:lvlJc w:val="left"/>
+      <w:pPr>
+        <w:tabs>
+          <w:tab w:val="num" w:pos="2880"/>
+        </w:tabs>
+        <w:ind w:left="2880" w:hanging="360"/>
+      </w:pPr>
+    </w:lvl>
+    <w:lvl w:ilvl="4" w:tentative="1">
+      <w:start w:val="1"/>
+      <w:numFmt w:val="decimal"/>
+      <w:lvlText w:val="%5."/>
+      <w:lvlJc w:val="left"/>
+      <w:pPr>
+        <w:tabs>
+          <w:tab w:val="num" w:pos="3600"/>
+        </w:tabs>
+        <w:ind w:left="3600" w:hanging="360"/>
+      </w:pPr>
+    </w:lvl>
+    <w:lvl w:ilvl="5" w:tentative="1">
+      <w:start w:val="1"/>
+      <w:numFmt w:val="decimal"/>
+      <w:lvlText w:val="%6."/>
+      <w:lvlJc w:val="left"/>
+      <w:pPr>
+        <w:tabs>
+          <w:tab w:val="num" w:pos="4320"/>
+        </w:tabs>
+        <w:ind w:left="4320" w:hanging="360"/>
+      </w:pPr>
+    </w:lvl>
+    <w:lvl w:ilvl="6" w:tentative="1">
+      <w:start w:val="1"/>
+      <w:numFmt w:val="decimal"/>
+      <w:lvlText w:val="%7."/>
+      <w:lvlJc w:val="left"/>
+      <w:pPr>
+        <w:tabs>
+          <w:tab w:val="num" w:pos="5040"/>
+        </w:tabs>
+        <w:ind w:left="5040" w:hanging="360"/>
+      </w:pPr>
+    </w:lvl>
+    <w:lvl w:ilvl="7" w:tentative="1">
+      <w:start w:val="1"/>
+      <w:numFmt w:val="decimal"/>
+      <w:lvlText w:val="%8."/>
+      <w:lvlJc w:val="left"/>
+      <w:pPr>
+        <w:tabs>
+          <w:tab w:val="num" w:pos="5760"/>
+        </w:tabs>
+        <w:ind w:left="5760" w:hanging="360"/>
+      </w:pPr>
+    </w:lvl>
+    <w:lvl w:ilvl="8" w:tentative="1">
+      <w:start w:val="1"/>
+      <w:numFmt w:val="decimal"/>
+      <w:lvlText w:val="%9."/>
+      <w:lvlJc w:val="left"/>
+      <w:pPr>
+        <w:tabs>
+          <w:tab w:val="num" w:pos="6480"/>
+        </w:tabs>
+        <w:ind w:left="6480" w:hanging="360"/>
+      </w:pPr>
+    </w:lvl>
+  </w:abstractNum>
+  <w:num w:numId="1" w16cid:durableId="1693258119">
+    <w:abstractNumId w:val="0"/>
+  </w:num>
+  <w:num w:numId="2" w16cid:durableId="204682244">
+    <w:abstractNumId w:val="1"/>
+  </w:num>
+</w:numbering>
 </file>
 
 <file path=word/styles.xml><?xml version="1.0" encoding="utf-8"?>
@@ -1165,6 +3874,9 @@
     <w:name w:val="Normal"/>
     <w:qFormat/>
     <w:rsid w:val="00CC6006"/>
+    <w:rPr>
+      <w:lang w:val="en-US"/>
+    </w:rPr>
   </w:style>
   <w:style w:type="paragraph" w:styleId="Kop1">
     <w:name w:val="heading 1"/>
@@ -1193,7 +3905,6 @@
     <w:next w:val="Standaard"/>
     <w:link w:val="Kop2Char"/>
     <w:uiPriority w:val="9"/>
-    <w:semiHidden/>
     <w:unhideWhenUsed/>
     <w:qFormat/>
     <w:rsid w:val="00576D3F"/>
@@ -1368,7 +4079,6 @@
   <w:style w:type="character" w:default="1" w:styleId="Standaardalinea-lettertype">
     <w:name w:val="Default Paragraph Font"/>
     <w:uiPriority w:val="1"/>
-    <w:semiHidden/>
     <w:unhideWhenUsed/>
   </w:style>
   <w:style w:type="table" w:default="1" w:styleId="Standaardtabel">
@@ -1410,7 +4120,6 @@
     <w:basedOn w:val="Standaardalinea-lettertype"/>
     <w:link w:val="Kop2"/>
     <w:uiPriority w:val="9"/>
-    <w:semiHidden/>
     <w:rsid w:val="00576D3F"/>
     <w:rPr>
       <w:rFonts w:asciiTheme="majorHAnsi" w:eastAsiaTheme="majorEastAsia" w:hAnsiTheme="majorHAnsi" w:cstheme="majorBidi"/>
@@ -1711,6 +4420,109 @@
       <w14:ligatures w14:val="none"/>
     </w:rPr>
   </w:style>
+  <w:style w:type="character" w:styleId="Hyperlink">
+    <w:name w:val="Hyperlink"/>
+    <w:basedOn w:val="Standaardalinea-lettertype"/>
+    <w:uiPriority w:val="99"/>
+    <w:unhideWhenUsed/>
+    <w:rsid w:val="004D0CA8"/>
+    <w:rPr>
+      <w:color w:val="467886" w:themeColor="hyperlink"/>
+      <w:u w:val="single"/>
+    </w:rPr>
+  </w:style>
+  <w:style w:type="character" w:styleId="Onopgelostemelding">
+    <w:name w:val="Unresolved Mention"/>
+    <w:basedOn w:val="Standaardalinea-lettertype"/>
+    <w:uiPriority w:val="99"/>
+    <w:semiHidden/>
+    <w:unhideWhenUsed/>
+    <w:rsid w:val="004D0CA8"/>
+    <w:rPr>
+      <w:color w:val="605E5C"/>
+      <w:shd w:val="clear" w:color="auto" w:fill="E1DFDD"/>
+    </w:rPr>
+  </w:style>
+  <w:style w:type="table" w:styleId="Tabelraster">
+    <w:name w:val="Table Grid"/>
+    <w:basedOn w:val="Standaardtabel"/>
+    <w:uiPriority w:val="39"/>
+    <w:rsid w:val="00896247"/>
+    <w:pPr>
+      <w:spacing w:after="0" w:line="240" w:lineRule="auto"/>
+    </w:pPr>
+    <w:tblPr>
+      <w:tblBorders>
+        <w:top w:val="single" w:sz="4" w:space="0" w:color="auto"/>
+        <w:left w:val="single" w:sz="4" w:space="0" w:color="auto"/>
+        <w:bottom w:val="single" w:sz="4" w:space="0" w:color="auto"/>
+        <w:right w:val="single" w:sz="4" w:space="0" w:color="auto"/>
+        <w:insideH w:val="single" w:sz="4" w:space="0" w:color="auto"/>
+        <w:insideV w:val="single" w:sz="4" w:space="0" w:color="auto"/>
+      </w:tblBorders>
+    </w:tblPr>
+  </w:style>
+  <w:style w:type="paragraph" w:styleId="Kopvaninhoudsopgave">
+    <w:name w:val="TOC Heading"/>
+    <w:basedOn w:val="Kop1"/>
+    <w:next w:val="Standaard"/>
+    <w:uiPriority w:val="39"/>
+    <w:unhideWhenUsed/>
+    <w:qFormat/>
+    <w:rsid w:val="00AF195C"/>
+    <w:pPr>
+      <w:spacing w:before="240" w:after="0"/>
+      <w:outlineLvl w:val="9"/>
+    </w:pPr>
+    <w:rPr>
+      <w:kern w:val="0"/>
+      <w:sz w:val="32"/>
+      <w:szCs w:val="32"/>
+      <w:lang w:eastAsia="ko-KR"/>
+      <w14:ligatures w14:val="none"/>
+    </w:rPr>
+  </w:style>
+  <w:style w:type="paragraph" w:styleId="Inhopg2">
+    <w:name w:val="toc 2"/>
+    <w:basedOn w:val="Standaard"/>
+    <w:next w:val="Standaard"/>
+    <w:autoRedefine/>
+    <w:uiPriority w:val="39"/>
+    <w:unhideWhenUsed/>
+    <w:rsid w:val="00AF195C"/>
+    <w:pPr>
+      <w:spacing w:after="100"/>
+      <w:ind w:left="220"/>
+    </w:pPr>
+  </w:style>
+  <w:style w:type="character" w:styleId="GevolgdeHyperlink">
+    <w:name w:val="FollowedHyperlink"/>
+    <w:basedOn w:val="Standaardalinea-lettertype"/>
+    <w:uiPriority w:val="99"/>
+    <w:semiHidden/>
+    <w:unhideWhenUsed/>
+    <w:rsid w:val="00E62472"/>
+    <w:rPr>
+      <w:color w:val="96607D" w:themeColor="followedHyperlink"/>
+      <w:u w:val="single"/>
+    </w:rPr>
+  </w:style>
+  <w:style w:type="paragraph" w:customStyle="1" w:styleId="messagelistitem5126c">
+    <w:name w:val="messagelistitem__5126c"/>
+    <w:basedOn w:val="Standaard"/>
+    <w:rsid w:val="00A17BDF"/>
+    <w:pPr>
+      <w:spacing w:before="100" w:beforeAutospacing="1" w:after="100" w:afterAutospacing="1" w:line="240" w:lineRule="auto"/>
+    </w:pPr>
+    <w:rPr>
+      <w:rFonts w:ascii="Times New Roman" w:eastAsia="Times New Roman" w:hAnsi="Times New Roman" w:cs="Times New Roman"/>
+      <w:kern w:val="0"/>
+      <w:sz w:val="24"/>
+      <w:szCs w:val="24"/>
+      <w:lang w:eastAsia="ko-KR"/>
+      <w14:ligatures w14:val="none"/>
+    </w:rPr>
+  </w:style>
 </w:styles>
 </file>
 
@@ -2007,4 +4819,16 @@
     </a:ext>
   </a:extLst>
 </a:theme>
+</file>
+
+<file path=customXml/item1.xml><?xml version="1.0" encoding="utf-8"?>
+<b:Sources xmlns:b="http://schemas.openxmlformats.org/officeDocument/2006/bibliography" xmlns="http://schemas.openxmlformats.org/officeDocument/2006/bibliography" SelectedStyle="\APASixthEditionOfficeOnline.xsl" StyleName="APA" Version="6"/>
+</file>
+
+<file path=customXml/itemProps1.xml><?xml version="1.0" encoding="utf-8"?>
+<ds:datastoreItem xmlns:ds="http://schemas.openxmlformats.org/officeDocument/2006/customXml" ds:itemID="{5E284163-AE2D-4A5E-9029-4173308A7CA3}">
+  <ds:schemaRefs>
+    <ds:schemaRef ds:uri="http://schemas.openxmlformats.org/officeDocument/2006/bibliography"/>
+  </ds:schemaRefs>
+</ds:datastoreItem>
 </file>
</xml_diff>